<commit_message>
Aggiorna UDA alle Indicazioni 2025 e aggiunge pagine chi-siamo, policy editoriale e kit privacy/toponomastica
Allinea le tre UDA al D.M. 221/2025 (competenze, fase di restituzione alla
comunità, Diario visivo, inclusione BES, alt-text); pubblica policy editoriale,
chi-siamo, kit privacy/liberatorie e scheda toponomastica difficile; corregge
il claim statistico e la privacy della pagina di simulazione in homepage.

Co-Authored-By: Claude Sonnet 5 <noreply@anthropic.com>
</commit_message>
<xml_diff>
--- a/UDA/UDA_ViaPerVia_Primaria.docx
+++ b/UDA/UDA_ViaPerVia_Primaria.docx
@@ -44,17 +44,6 @@
     </w:p>
     <w:p>
       <w:pPr>
-        <w:pStyle w:val="HorizontalLine"/>
-        <w:bidi w:val="0"/>
-        <w:jc w:val="left"/>
-        <w:rPr/>
-      </w:pPr>
-      <w:r>
-        <w:rPr/>
-      </w:r>
-    </w:p>
-    <w:p>
-      <w:pPr>
         <w:pStyle w:val="BlockQuotation"/>
         <w:bidi w:val="0"/>
         <w:jc w:val="left"/>
@@ -79,17 +68,6 @@
       <w:r>
         <w:rPr/>
         <w:t xml:space="preserve"> sono segnaposto da personalizzare.</w:t>
-      </w:r>
-    </w:p>
-    <w:p>
-      <w:pPr>
-        <w:pStyle w:val="HorizontalLine"/>
-        <w:bidi w:val="0"/>
-        <w:jc w:val="left"/>
-        <w:rPr/>
-      </w:pPr>
-      <w:r>
-        <w:rPr/>
       </w:r>
     </w:p>
     <w:p>
@@ -570,17 +548,6 @@
     </w:p>
     <w:p>
       <w:pPr>
-        <w:pStyle w:val="HorizontalLine"/>
-        <w:bidi w:val="0"/>
-        <w:jc w:val="left"/>
-        <w:rPr/>
-      </w:pPr>
-      <w:r>
-        <w:rPr/>
-      </w:r>
-    </w:p>
-    <w:p>
-      <w:pPr>
         <w:pStyle w:val="Heading2"/>
         <w:bidi w:val="0"/>
         <w:ind w:hanging="0" w:left="0"/>
@@ -724,7 +691,7 @@
       </w:pPr>
       <w:r>
         <w:rPr/>
-        <w:t>Traguardi di sviluppo delle competenze (Indicazioni Nazionali 2012)</w:t>
+        <w:t>Traguardi di sviluppo delle competenze (Indicazioni Nazionali 2025 — D.M. 221/2025)</w:t>
       </w:r>
     </w:p>
     <w:p>
@@ -759,7 +726,7 @@
       </w:pPr>
       <w:r>
         <w:rPr/>
-        <w:t>Ricava informazioni da testi letti e le sintetizza con parole proprie.</w:t>
+        <w:t>Affronta la scrittura come processo: ideazione, pianificazione, stesura e revisione del testo, anche attraverso la revisione tra pari.</w:t>
       </w:r>
     </w:p>
     <w:p>
@@ -780,7 +747,7 @@
       </w:pPr>
       <w:r>
         <w:rPr/>
-        <w:t>Produce testi descrittivi e informativi su argomenti conosciuti.</w:t>
+        <w:t>Produce testi informativi e descrittivi corretti e chiari su argomenti conosciuti, adeguati a un destinatario reale.</w:t>
       </w:r>
     </w:p>
     <w:p>
@@ -801,7 +768,28 @@
       </w:pPr>
       <w:r>
         <w:rPr/>
-        <w:t>Utilizza semplici strumenti digitali per la comunicazione.</w:t>
+        <w:t>Ricava informazioni da fonti diverse e le rielabora con parole proprie, citando le fonti utilizzate.</w:t>
+      </w:r>
+    </w:p>
+    <w:p>
+      <w:pPr>
+        <w:pStyle w:val="BodyText"/>
+        <w:numPr>
+          <w:ilvl w:val="0"/>
+          <w:numId w:val="3"/>
+        </w:numPr>
+        <w:tabs>
+          <w:tab w:val="clear" w:pos="709"/>
+          <w:tab w:val="left" w:pos="709" w:leader="none"/>
+        </w:tabs>
+        <w:bidi w:val="0"/>
+        <w:ind w:hanging="283" w:left="709"/>
+        <w:jc w:val="left"/>
+        <w:rPr/>
+      </w:pPr>
+      <w:r>
+        <w:rPr/>
+        <w:t>Espone oralmente il proprio lavoro in modo chiaro e ordinato davanti a un pubblico.</w:t>
       </w:r>
     </w:p>
     <w:p>
@@ -836,7 +824,7 @@
       </w:pPr>
       <w:r>
         <w:rPr/>
-        <w:t>Conosce aspetti del patrimonio storico e culturale del territorio locale.</w:t>
+        <w:t>Conosce e valorizza aspetti del patrimonio storico e culturale del territorio locale, collocandoli progressivamente nel quadro della storia più ampia.</w:t>
       </w:r>
     </w:p>
     <w:p>
@@ -857,7 +845,28 @@
       </w:pPr>
       <w:r>
         <w:rPr/>
-        <w:t>Usa fonti di diverso tipo per ricostruire un fatto o un personaggio.</w:t>
+        <w:t>Usa fonti di diverso tipo (scritte, iconografiche, orali) per ricostruire un fatto o un personaggio.</w:t>
+      </w:r>
+    </w:p>
+    <w:p>
+      <w:pPr>
+        <w:pStyle w:val="BodyText"/>
+        <w:numPr>
+          <w:ilvl w:val="0"/>
+          <w:numId w:val="4"/>
+        </w:numPr>
+        <w:tabs>
+          <w:tab w:val="clear" w:pos="709"/>
+          <w:tab w:val="left" w:pos="709" w:leader="none"/>
+        </w:tabs>
+        <w:bidi w:val="0"/>
+        <w:ind w:hanging="283" w:left="709"/>
+        <w:jc w:val="left"/>
+        <w:rPr/>
+      </w:pPr>
+      <w:r>
+        <w:rPr/>
+        <w:t>Riconosce nella toponomastica una forma di memoria pubblica della comunità.</w:t>
       </w:r>
     </w:p>
     <w:p>
@@ -892,7 +901,7 @@
       </w:pPr>
       <w:r>
         <w:rPr/>
-        <w:t>Si orienta sulle mappe del territorio circostante.</w:t>
+        <w:t>Legge e interpreta il proprio spazio vissuto collocando fatti e relazioni a scale diverse, dal quartiere alla dimensione nazionale (transcalarità).</w:t>
       </w:r>
     </w:p>
     <w:p>
@@ -913,7 +922,49 @@
       </w:pPr>
       <w:r>
         <w:rPr/>
-        <w:t>Colloca luoghi su una mappa digitale.</w:t>
+        <w:t>Osserva e descrive il paesaggio urbano come spazio di co-evoluzione tra le persone e l'ambiente, cogliendone anche la dimensione estetica ed emozionale.</w:t>
+      </w:r>
+    </w:p>
+    <w:p>
+      <w:pPr>
+        <w:pStyle w:val="BodyText"/>
+        <w:numPr>
+          <w:ilvl w:val="0"/>
+          <w:numId w:val="5"/>
+        </w:numPr>
+        <w:tabs>
+          <w:tab w:val="clear" w:pos="709"/>
+          <w:tab w:val="left" w:pos="709" w:leader="none"/>
+        </w:tabs>
+        <w:bidi w:val="0"/>
+        <w:ind w:hanging="283" w:left="709"/>
+        <w:jc w:val="left"/>
+        <w:rPr/>
+      </w:pPr>
+      <w:r>
+        <w:rPr/>
+        <w:t>Comprende come la comunità abita e trasforma il proprio territorio nel tempo (territorializzazione), a partire dall'osservazione diretta di una via.</w:t>
+      </w:r>
+    </w:p>
+    <w:p>
+      <w:pPr>
+        <w:pStyle w:val="BodyText"/>
+        <w:numPr>
+          <w:ilvl w:val="0"/>
+          <w:numId w:val="5"/>
+        </w:numPr>
+        <w:tabs>
+          <w:tab w:val="clear" w:pos="709"/>
+          <w:tab w:val="left" w:pos="709" w:leader="none"/>
+        </w:tabs>
+        <w:bidi w:val="0"/>
+        <w:ind w:hanging="283" w:left="709"/>
+        <w:jc w:val="left"/>
+        <w:rPr/>
+      </w:pPr>
+      <w:r>
+        <w:rPr/>
+        <w:t>Si orienta sulle mappe e colloca luoghi su una mappa digitale.</w:t>
       </w:r>
     </w:p>
     <w:p>
@@ -927,7 +978,7 @@
         <w:rPr>
           <w:b/>
         </w:rPr>
-        <w:t>Educazione Civica (L. 92/2019)</w:t>
+        <w:t>Arte e Immagine</w:t>
       </w:r>
     </w:p>
     <w:p>
@@ -948,7 +999,7 @@
       </w:pPr>
       <w:r>
         <w:rPr/>
-        <w:t>Riconosce il significato civico dei luoghi della propria città.</w:t>
+        <w:t>Collega le immagini e le opere osservate nel territorio al proprio vissuto personale.</w:t>
       </w:r>
     </w:p>
     <w:p>
@@ -969,7 +1020,28 @@
       </w:pPr>
       <w:r>
         <w:rPr/>
-        <w:t>Partecipa attivamente a un progetto collettivo che coinvolge la comunità.</w:t>
+        <w:t>Realizza elaborati grafici originali e li raccoglie in un Diario visivo, integrando emozioni, tecnica e contesto storico.</w:t>
+      </w:r>
+    </w:p>
+    <w:p>
+      <w:pPr>
+        <w:pStyle w:val="BodyText"/>
+        <w:numPr>
+          <w:ilvl w:val="0"/>
+          <w:numId w:val="6"/>
+        </w:numPr>
+        <w:tabs>
+          <w:tab w:val="clear" w:pos="709"/>
+          <w:tab w:val="left" w:pos="709" w:leader="none"/>
+        </w:tabs>
+        <w:bidi w:val="0"/>
+        <w:ind w:hanging="283" w:left="709"/>
+        <w:jc w:val="left"/>
+        <w:rPr/>
+      </w:pPr>
+      <w:r>
+        <w:rPr/>
+        <w:t>Osserva dal vero elementi del patrimonio locale (edifici, targhe, decorazioni) durante l'uscita sul campo.</w:t>
       </w:r>
     </w:p>
     <w:p>
@@ -983,7 +1055,7 @@
         <w:rPr>
           <w:b/>
         </w:rPr>
-        <w:t>Tecnologia / TIC</w:t>
+        <w:t>Educazione Civica (L. 92/2019 — Linee guida D.M. 183/2024)</w:t>
       </w:r>
     </w:p>
     <w:p>
@@ -1004,7 +1076,7 @@
       </w:pPr>
       <w:r>
         <w:rPr/>
-        <w:t>Utilizza strumenti digitali per raccogliere, organizzare e presentare informazioni.</w:t>
+        <w:t>Riconosce il significato civico dei luoghi della propria città e il valore della memoria collettiva.</w:t>
       </w:r>
     </w:p>
     <w:p>
@@ -1025,43 +1097,42 @@
       </w:pPr>
       <w:r>
         <w:rPr/>
-        <w:t>Collabora alla costruzione di una semplice pagina web (con guida del docente).</w:t>
-      </w:r>
-    </w:p>
-    <w:p>
-      <w:pPr>
-        <w:pStyle w:val="HorizontalLine"/>
-        <w:bidi w:val="0"/>
-        <w:jc w:val="left"/>
-        <w:rPr/>
-      </w:pPr>
-      <w:r>
-        <w:rPr/>
-      </w:r>
-    </w:p>
-    <w:p>
-      <w:pPr>
-        <w:pStyle w:val="Heading2"/>
-        <w:bidi w:val="0"/>
-        <w:ind w:hanging="0" w:left="0"/>
-        <w:jc w:val="left"/>
-        <w:rPr/>
-      </w:pPr>
-      <w:r>
-        <w:rPr/>
-        <w:t>SEZIONE 3 — Obiettivi di apprendimento</w:t>
-      </w:r>
-    </w:p>
-    <w:p>
-      <w:pPr>
-        <w:pStyle w:val="BodyText"/>
-        <w:bidi w:val="0"/>
-        <w:jc w:val="left"/>
-        <w:rPr/>
-      </w:pPr>
-      <w:r>
-        <w:rPr/>
-        <w:t>Al termine del percorso l'alunno è in grado di:</w:t>
+        <w:t>Partecipa attivamente a un progetto che restituisce un contributo concreto alla comunità locale.</w:t>
+      </w:r>
+    </w:p>
+    <w:p>
+      <w:pPr>
+        <w:pStyle w:val="BodyText"/>
+        <w:numPr>
+          <w:ilvl w:val="0"/>
+          <w:numId w:val="7"/>
+        </w:numPr>
+        <w:tabs>
+          <w:tab w:val="clear" w:pos="709"/>
+          <w:tab w:val="left" w:pos="709" w:leader="none"/>
+        </w:tabs>
+        <w:bidi w:val="0"/>
+        <w:ind w:hanging="283" w:left="709"/>
+        <w:jc w:val="left"/>
+        <w:rPr/>
+      </w:pPr>
+      <w:r>
+        <w:rPr/>
+        <w:t>Conosce, in forma essenziale, il senso del diritto d'autore e delle licenze aperte.</w:t>
+      </w:r>
+    </w:p>
+    <w:p>
+      <w:pPr>
+        <w:pStyle w:val="BodyText"/>
+        <w:bidi w:val="0"/>
+        <w:jc w:val="left"/>
+        <w:rPr/>
+      </w:pPr>
+      <w:r>
+        <w:rPr>
+          <w:b/>
+        </w:rPr>
+        <w:t>Tecnologia</w:t>
       </w:r>
     </w:p>
     <w:p>
@@ -1082,7 +1153,7 @@
       </w:pPr>
       <w:r>
         <w:rPr/>
-        <w:t>Scegliere autonomamente una via o piazza della propria città e motivare la scelta.</w:t>
+        <w:t>Utilizza strumenti digitali per raccogliere, organizzare e presentare informazioni.</w:t>
       </w:r>
     </w:p>
     <w:p>
@@ -1103,6 +1174,91 @@
       </w:pPr>
       <w:r>
         <w:rPr/>
+        <w:t>Collabora, con la guida del docente, alla costruzione di una semplice pagina web accessibile (immagini con testo alternativo, titoli chiari).</w:t>
+      </w:r>
+    </w:p>
+    <w:p>
+      <w:pPr>
+        <w:pStyle w:val="BlockQuotation"/>
+        <w:bidi w:val="0"/>
+        <w:jc w:val="left"/>
+        <w:rPr/>
+      </w:pPr>
+      <w:r>
+        <w:rPr>
+          <w:b/>
+        </w:rPr>
+        <w:t>Nota per il periodo transitorio.</w:t>
+      </w:r>
+      <w:r>
+        <w:rPr/>
+        <w:t xml:space="preserve"> Per le classi intermedie attive nell'a.s. 2025/26 restano valide le Indicazioni 2012; i traguardi sopra elencati sono compatibili con entrambi i quadri.</w:t>
+      </w:r>
+    </w:p>
+    <w:p>
+      <w:pPr>
+        <w:pStyle w:val="Heading2"/>
+        <w:bidi w:val="0"/>
+        <w:ind w:hanging="0" w:left="0"/>
+        <w:jc w:val="left"/>
+        <w:rPr/>
+      </w:pPr>
+      <w:r>
+        <w:rPr/>
+        <w:t>SEZIONE 3 — Obiettivi di apprendimento</w:t>
+      </w:r>
+    </w:p>
+    <w:p>
+      <w:pPr>
+        <w:pStyle w:val="BodyText"/>
+        <w:bidi w:val="0"/>
+        <w:jc w:val="left"/>
+        <w:rPr/>
+      </w:pPr>
+      <w:r>
+        <w:rPr/>
+        <w:t>Al termine del percorso l'alunno è in grado di:</w:t>
+      </w:r>
+    </w:p>
+    <w:p>
+      <w:pPr>
+        <w:pStyle w:val="BodyText"/>
+        <w:numPr>
+          <w:ilvl w:val="0"/>
+          <w:numId w:val="9"/>
+        </w:numPr>
+        <w:tabs>
+          <w:tab w:val="clear" w:pos="709"/>
+          <w:tab w:val="left" w:pos="709" w:leader="none"/>
+        </w:tabs>
+        <w:bidi w:val="0"/>
+        <w:ind w:hanging="283" w:left="709"/>
+        <w:jc w:val="left"/>
+        <w:rPr/>
+      </w:pPr>
+      <w:r>
+        <w:rPr/>
+        <w:t>Scegliere autonomamente una via o piazza della propria città e motivare la scelta.</w:t>
+      </w:r>
+    </w:p>
+    <w:p>
+      <w:pPr>
+        <w:pStyle w:val="BodyText"/>
+        <w:numPr>
+          <w:ilvl w:val="0"/>
+          <w:numId w:val="9"/>
+        </w:numPr>
+        <w:tabs>
+          <w:tab w:val="clear" w:pos="709"/>
+          <w:tab w:val="left" w:pos="709" w:leader="none"/>
+        </w:tabs>
+        <w:bidi w:val="0"/>
+        <w:ind w:hanging="283" w:left="709"/>
+        <w:jc w:val="left"/>
+        <w:rPr/>
+      </w:pPr>
+      <w:r>
+        <w:rPr/>
         <w:t>Raccogliere informazioni su più fonti (testi, web, testimonianze orali).</w:t>
       </w:r>
     </w:p>
@@ -1111,7 +1267,7 @@
         <w:pStyle w:val="BodyText"/>
         <w:numPr>
           <w:ilvl w:val="0"/>
-          <w:numId w:val="8"/>
+          <w:numId w:val="9"/>
         </w:numPr>
         <w:tabs>
           <w:tab w:val="clear" w:pos="709"/>
@@ -1132,7 +1288,7 @@
         <w:pStyle w:val="BodyText"/>
         <w:numPr>
           <w:ilvl w:val="0"/>
-          <w:numId w:val="8"/>
+          <w:numId w:val="9"/>
         </w:numPr>
         <w:tabs>
           <w:tab w:val="clear" w:pos="709"/>
@@ -1153,7 +1309,7 @@
         <w:pStyle w:val="BodyText"/>
         <w:numPr>
           <w:ilvl w:val="0"/>
-          <w:numId w:val="8"/>
+          <w:numId w:val="9"/>
         </w:numPr>
         <w:tabs>
           <w:tab w:val="clear" w:pos="709"/>
@@ -1174,7 +1330,7 @@
         <w:pStyle w:val="BodyText"/>
         <w:numPr>
           <w:ilvl w:val="0"/>
-          <w:numId w:val="8"/>
+          <w:numId w:val="9"/>
         </w:numPr>
         <w:tabs>
           <w:tab w:val="clear" w:pos="709"/>
@@ -1195,7 +1351,7 @@
         <w:pStyle w:val="BodyText"/>
         <w:numPr>
           <w:ilvl w:val="0"/>
-          <w:numId w:val="8"/>
+          <w:numId w:val="9"/>
         </w:numPr>
         <w:tabs>
           <w:tab w:val="clear" w:pos="709"/>
@@ -1216,7 +1372,7 @@
         <w:pStyle w:val="BodyText"/>
         <w:numPr>
           <w:ilvl w:val="0"/>
-          <w:numId w:val="8"/>
+          <w:numId w:val="9"/>
         </w:numPr>
         <w:tabs>
           <w:tab w:val="clear" w:pos="709"/>
@@ -1234,18 +1390,11 @@
     </w:p>
     <w:p>
       <w:pPr>
-        <w:pStyle w:val="HorizontalLine"/>
-        <w:bidi w:val="0"/>
-        <w:jc w:val="left"/>
-        <w:rPr/>
-      </w:pPr>
-      <w:r>
-        <w:rPr/>
-      </w:r>
-    </w:p>
-    <w:p>
-      <w:pPr>
         <w:pStyle w:val="Heading2"/>
+        <w:numPr>
+          <w:ilvl w:val="0"/>
+          <w:numId w:val="0"/>
+        </w:numPr>
         <w:bidi w:val="0"/>
         <w:ind w:hanging="0" w:left="0"/>
         <w:jc w:val="left"/>
@@ -1270,8 +1419,8 @@
         </w:tblCellMar>
       </w:tblPr>
       <w:tblGrid>
-        <w:gridCol w:w="1923"/>
-        <w:gridCol w:w="7714"/>
+        <w:gridCol w:w="2046"/>
+        <w:gridCol w:w="7591"/>
       </w:tblGrid>
       <w:tr>
         <w:trPr>
@@ -1279,7 +1428,7 @@
         </w:trPr>
         <w:tc>
           <w:tcPr>
-            <w:tcW w:w="1923" w:type="dxa"/>
+            <w:tcW w:w="2046" w:type="dxa"/>
             <w:tcBorders>
               <w:top w:val="single" w:sz="4" w:space="0" w:color="000000"/>
               <w:left w:val="single" w:sz="4" w:space="0" w:color="000000"/>
@@ -1301,7 +1450,7 @@
         </w:tc>
         <w:tc>
           <w:tcPr>
-            <w:tcW w:w="7714" w:type="dxa"/>
+            <w:tcW w:w="7591" w:type="dxa"/>
             <w:tcBorders>
               <w:top w:val="single" w:sz="4" w:space="0" w:color="000000"/>
               <w:left w:val="single" w:sz="4" w:space="0" w:color="000000"/>
@@ -1327,7 +1476,7 @@
         <w:trPr/>
         <w:tc>
           <w:tcPr>
-            <w:tcW w:w="1923" w:type="dxa"/>
+            <w:tcW w:w="2046" w:type="dxa"/>
             <w:tcBorders>
               <w:left w:val="single" w:sz="4" w:space="0" w:color="000000"/>
               <w:bottom w:val="single" w:sz="4" w:space="0" w:color="000000"/>
@@ -1348,7 +1497,7 @@
         </w:tc>
         <w:tc>
           <w:tcPr>
-            <w:tcW w:w="7714" w:type="dxa"/>
+            <w:tcW w:w="7591" w:type="dxa"/>
             <w:tcBorders>
               <w:left w:val="single" w:sz="4" w:space="0" w:color="000000"/>
               <w:bottom w:val="single" w:sz="4" w:space="0" w:color="000000"/>
@@ -1373,7 +1522,7 @@
         <w:trPr/>
         <w:tc>
           <w:tcPr>
-            <w:tcW w:w="1923" w:type="dxa"/>
+            <w:tcW w:w="2046" w:type="dxa"/>
             <w:tcBorders>
               <w:left w:val="single" w:sz="4" w:space="0" w:color="000000"/>
               <w:bottom w:val="single" w:sz="4" w:space="0" w:color="000000"/>
@@ -1394,7 +1543,7 @@
         </w:tc>
         <w:tc>
           <w:tcPr>
-            <w:tcW w:w="7714" w:type="dxa"/>
+            <w:tcW w:w="7591" w:type="dxa"/>
             <w:tcBorders>
               <w:left w:val="single" w:sz="4" w:space="0" w:color="000000"/>
               <w:bottom w:val="single" w:sz="4" w:space="0" w:color="000000"/>
@@ -1419,7 +1568,7 @@
         <w:trPr/>
         <w:tc>
           <w:tcPr>
-            <w:tcW w:w="1923" w:type="dxa"/>
+            <w:tcW w:w="2046" w:type="dxa"/>
             <w:tcBorders>
               <w:left w:val="single" w:sz="4" w:space="0" w:color="000000"/>
               <w:bottom w:val="single" w:sz="4" w:space="0" w:color="000000"/>
@@ -1440,7 +1589,7 @@
         </w:tc>
         <w:tc>
           <w:tcPr>
-            <w:tcW w:w="7714" w:type="dxa"/>
+            <w:tcW w:w="7591" w:type="dxa"/>
             <w:tcBorders>
               <w:left w:val="single" w:sz="4" w:space="0" w:color="000000"/>
               <w:bottom w:val="single" w:sz="4" w:space="0" w:color="000000"/>
@@ -1465,7 +1614,7 @@
         <w:trPr/>
         <w:tc>
           <w:tcPr>
-            <w:tcW w:w="1923" w:type="dxa"/>
+            <w:tcW w:w="2046" w:type="dxa"/>
             <w:tcBorders>
               <w:left w:val="single" w:sz="4" w:space="0" w:color="000000"/>
               <w:bottom w:val="single" w:sz="4" w:space="0" w:color="000000"/>
@@ -1486,7 +1635,7 @@
         </w:tc>
         <w:tc>
           <w:tcPr>
-            <w:tcW w:w="7714" w:type="dxa"/>
+            <w:tcW w:w="7591" w:type="dxa"/>
             <w:tcBorders>
               <w:left w:val="single" w:sz="4" w:space="0" w:color="000000"/>
               <w:bottom w:val="single" w:sz="4" w:space="0" w:color="000000"/>
@@ -1511,7 +1660,7 @@
         <w:trPr/>
         <w:tc>
           <w:tcPr>
-            <w:tcW w:w="1923" w:type="dxa"/>
+            <w:tcW w:w="2046" w:type="dxa"/>
             <w:tcBorders>
               <w:left w:val="single" w:sz="4" w:space="0" w:color="000000"/>
               <w:bottom w:val="single" w:sz="4" w:space="0" w:color="000000"/>
@@ -1532,7 +1681,7 @@
         </w:tc>
         <w:tc>
           <w:tcPr>
-            <w:tcW w:w="7714" w:type="dxa"/>
+            <w:tcW w:w="7591" w:type="dxa"/>
             <w:tcBorders>
               <w:left w:val="single" w:sz="4" w:space="0" w:color="000000"/>
               <w:bottom w:val="single" w:sz="4" w:space="0" w:color="000000"/>
@@ -1557,7 +1706,7 @@
         <w:trPr/>
         <w:tc>
           <w:tcPr>
-            <w:tcW w:w="1923" w:type="dxa"/>
+            <w:tcW w:w="2046" w:type="dxa"/>
             <w:tcBorders>
               <w:left w:val="single" w:sz="4" w:space="0" w:color="000000"/>
               <w:bottom w:val="single" w:sz="4" w:space="0" w:color="000000"/>
@@ -1578,7 +1727,7 @@
         </w:tc>
         <w:tc>
           <w:tcPr>
-            <w:tcW w:w="7714" w:type="dxa"/>
+            <w:tcW w:w="7591" w:type="dxa"/>
             <w:tcBorders>
               <w:left w:val="single" w:sz="4" w:space="0" w:color="000000"/>
               <w:bottom w:val="single" w:sz="4" w:space="0" w:color="000000"/>
@@ -1603,17 +1752,6 @@
     <w:p>
       <w:pPr>
         <w:pStyle w:val="BodyText"/>
-        <w:bidi w:val="0"/>
-        <w:jc w:val="left"/>
-        <w:rPr/>
-      </w:pPr>
-      <w:r>
-        <w:rPr/>
-      </w:r>
-    </w:p>
-    <w:p>
-      <w:pPr>
-        <w:pStyle w:val="HorizontalLine"/>
         <w:bidi w:val="0"/>
         <w:jc w:val="left"/>
         <w:rPr/>
@@ -1681,7 +1819,7 @@
         <w:pStyle w:val="BodyText"/>
         <w:numPr>
           <w:ilvl w:val="0"/>
-          <w:numId w:val="9"/>
+          <w:numId w:val="10"/>
         </w:numPr>
         <w:tabs>
           <w:tab w:val="clear" w:pos="709"/>
@@ -1702,7 +1840,7 @@
         <w:pStyle w:val="BodyText"/>
         <w:numPr>
           <w:ilvl w:val="0"/>
-          <w:numId w:val="9"/>
+          <w:numId w:val="10"/>
         </w:numPr>
         <w:tabs>
           <w:tab w:val="clear" w:pos="709"/>
@@ -1723,7 +1861,7 @@
         <w:pStyle w:val="BodyText"/>
         <w:numPr>
           <w:ilvl w:val="0"/>
-          <w:numId w:val="9"/>
+          <w:numId w:val="10"/>
         </w:numPr>
         <w:tabs>
           <w:tab w:val="clear" w:pos="709"/>
@@ -1744,7 +1882,7 @@
         <w:pStyle w:val="BodyText"/>
         <w:numPr>
           <w:ilvl w:val="0"/>
-          <w:numId w:val="9"/>
+          <w:numId w:val="10"/>
         </w:numPr>
         <w:tabs>
           <w:tab w:val="clear" w:pos="709"/>
@@ -1758,6 +1896,27 @@
       <w:r>
         <w:rPr/>
         <w:t>Ogni alunno (o gruppo) sceglie la propria via e la registra in un foglio di progetto.</w:t>
+      </w:r>
+    </w:p>
+    <w:p>
+      <w:pPr>
+        <w:pStyle w:val="BodyText"/>
+        <w:numPr>
+          <w:ilvl w:val="0"/>
+          <w:numId w:val="10"/>
+        </w:numPr>
+        <w:tabs>
+          <w:tab w:val="clear" w:pos="709"/>
+          <w:tab w:val="left" w:pos="709" w:leader="none"/>
+        </w:tabs>
+        <w:bidi w:val="0"/>
+        <w:ind w:hanging="283" w:left="709"/>
+        <w:jc w:val="left"/>
+        <w:rPr/>
+      </w:pPr>
+      <w:r>
+        <w:rPr/>
+        <w:t>La classe delibera fin d'ora la forma di restituzione alla comunità (v. Fase finale), così da orientare la raccolta dei materiali.</w:t>
       </w:r>
     </w:p>
     <w:p>
@@ -1780,17 +1939,6 @@
     </w:p>
     <w:p>
       <w:pPr>
-        <w:pStyle w:val="HorizontalLine"/>
-        <w:bidi w:val="0"/>
-        <w:jc w:val="left"/>
-        <w:rPr/>
-      </w:pPr>
-      <w:r>
-        <w:rPr/>
-      </w:r>
-    </w:p>
-    <w:p>
-      <w:pPr>
         <w:pStyle w:val="Heading3"/>
         <w:bidi w:val="0"/>
         <w:ind w:hanging="0" w:left="0"/>
@@ -1835,7 +1983,7 @@
         <w:pStyle w:val="BodyText"/>
         <w:numPr>
           <w:ilvl w:val="0"/>
-          <w:numId w:val="10"/>
+          <w:numId w:val="11"/>
         </w:numPr>
         <w:tabs>
           <w:tab w:val="clear" w:pos="709"/>
@@ -1856,7 +2004,7 @@
         <w:pStyle w:val="BodyText"/>
         <w:numPr>
           <w:ilvl w:val="0"/>
-          <w:numId w:val="10"/>
+          <w:numId w:val="11"/>
         </w:numPr>
         <w:tabs>
           <w:tab w:val="clear" w:pos="709"/>
@@ -1877,7 +2025,7 @@
         <w:pStyle w:val="BodyText"/>
         <w:numPr>
           <w:ilvl w:val="0"/>
-          <w:numId w:val="10"/>
+          <w:numId w:val="11"/>
         </w:numPr>
         <w:tabs>
           <w:tab w:val="clear" w:pos="709"/>
@@ -1931,17 +2079,6 @@
     </w:p>
     <w:p>
       <w:pPr>
-        <w:pStyle w:val="HorizontalLine"/>
-        <w:bidi w:val="0"/>
-        <w:jc w:val="left"/>
-        <w:rPr/>
-      </w:pPr>
-      <w:r>
-        <w:rPr/>
-      </w:r>
-    </w:p>
-    <w:p>
-      <w:pPr>
         <w:pStyle w:val="Heading3"/>
         <w:bidi w:val="0"/>
         <w:ind w:hanging="0" w:left="0"/>
@@ -1986,7 +2123,7 @@
         <w:pStyle w:val="BodyText"/>
         <w:numPr>
           <w:ilvl w:val="0"/>
-          <w:numId w:val="11"/>
+          <w:numId w:val="12"/>
         </w:numPr>
         <w:tabs>
           <w:tab w:val="clear" w:pos="709"/>
@@ -2007,7 +2144,7 @@
         <w:pStyle w:val="BodyText"/>
         <w:numPr>
           <w:ilvl w:val="0"/>
-          <w:numId w:val="11"/>
+          <w:numId w:val="12"/>
         </w:numPr>
         <w:tabs>
           <w:tab w:val="clear" w:pos="709"/>
@@ -2028,7 +2165,7 @@
         <w:pStyle w:val="BodyText"/>
         <w:numPr>
           <w:ilvl w:val="0"/>
-          <w:numId w:val="11"/>
+          <w:numId w:val="12"/>
         </w:numPr>
         <w:tabs>
           <w:tab w:val="clear" w:pos="709"/>
@@ -2049,7 +2186,7 @@
         <w:pStyle w:val="BodyText"/>
         <w:numPr>
           <w:ilvl w:val="0"/>
-          <w:numId w:val="11"/>
+          <w:numId w:val="12"/>
         </w:numPr>
         <w:tabs>
           <w:tab w:val="clear" w:pos="709"/>
@@ -2085,17 +2222,6 @@
     </w:p>
     <w:p>
       <w:pPr>
-        <w:pStyle w:val="HorizontalLine"/>
-        <w:bidi w:val="0"/>
-        <w:jc w:val="left"/>
-        <w:rPr/>
-      </w:pPr>
-      <w:r>
-        <w:rPr/>
-      </w:r>
-    </w:p>
-    <w:p>
-      <w:pPr>
         <w:pStyle w:val="Heading3"/>
         <w:bidi w:val="0"/>
         <w:ind w:hanging="0" w:left="0"/>
@@ -2104,7 +2230,7 @@
       </w:pPr>
       <w:r>
         <w:rPr/>
-        <w:t>Fase 4 — Contributi grafici e mappa</w:t>
+        <w:t>Fase 4 — Diario visivo e mappa</w:t>
       </w:r>
     </w:p>
     <w:p>
@@ -2140,7 +2266,7 @@
         <w:pStyle w:val="BodyText"/>
         <w:numPr>
           <w:ilvl w:val="0"/>
-          <w:numId w:val="12"/>
+          <w:numId w:val="13"/>
         </w:numPr>
         <w:tabs>
           <w:tab w:val="clear" w:pos="709"/>
@@ -2161,7 +2287,7 @@
         <w:pStyle w:val="BodyText"/>
         <w:numPr>
           <w:ilvl w:val="0"/>
-          <w:numId w:val="12"/>
+          <w:numId w:val="13"/>
         </w:numPr>
         <w:tabs>
           <w:tab w:val="clear" w:pos="709"/>
@@ -2175,6 +2301,67 @@
       <w:r>
         <w:rPr/>
         <w:t>Con la guida del docente, localizzano la via su Google Maps o OpenStreetMap e copiano il codice embed per la mappa interattiva.</w:t>
+      </w:r>
+    </w:p>
+    <w:p>
+      <w:pPr>
+        <w:pStyle w:val="BodyText"/>
+        <w:numPr>
+          <w:ilvl w:val="0"/>
+          <w:numId w:val="13"/>
+        </w:numPr>
+        <w:tabs>
+          <w:tab w:val="clear" w:pos="709"/>
+          <w:tab w:val="left" w:pos="709" w:leader="none"/>
+        </w:tabs>
+        <w:bidi w:val="0"/>
+        <w:ind w:hanging="283" w:left="709"/>
+        <w:jc w:val="left"/>
+        <w:rPr/>
+      </w:pPr>
+      <w:r>
+        <w:rPr/>
+        <w:t xml:space="preserve">Gli elaborati grafici realizzati durante e dopo l'uscita sul campo (disegni, schizzi, collage, fotografie) confluiscono nel </w:t>
+      </w:r>
+      <w:r>
+        <w:rPr>
+          <w:b/>
+        </w:rPr>
+        <w:t>Diario visivo di via</w:t>
+      </w:r>
+      <w:r>
+        <w:rPr/>
+        <w:t>: ogni elaborato è accompagnato da una didascalia in tre righe scritte dall'alunno — </w:t>
+      </w:r>
+      <w:r>
+        <w:rPr>
+          <w:b/>
+        </w:rPr>
+        <w:t>cosa ho provato</w:t>
+      </w:r>
+      <w:r>
+        <w:rPr/>
+        <w:t xml:space="preserve"> (emozione), </w:t>
+      </w:r>
+      <w:r>
+        <w:rPr>
+          <w:b/>
+        </w:rPr>
+        <w:t>come l'ho realizzato</w:t>
+      </w:r>
+      <w:r>
+        <w:rPr/>
+        <w:t xml:space="preserve"> (tecnica), </w:t>
+      </w:r>
+      <w:r>
+        <w:rPr>
+          <w:b/>
+        </w:rPr>
+        <w:t>cosa racconta della via e della sua storia</w:t>
+      </w:r>
+      <w:r>
+        <w:rPr/>
+        <w:t xml:space="preserve"> (contesto). Una selezione del Diario visivo entra nella pagina web pubblicata.</w:t>
       </w:r>
     </w:p>
     <w:p>
@@ -2192,18 +2379,7 @@
       </w:r>
       <w:r>
         <w:rPr/>
-        <w:t xml:space="preserve"> 1–2 elaborati grafici + link o codice della mappa.</w:t>
-      </w:r>
-    </w:p>
-    <w:p>
-      <w:pPr>
-        <w:pStyle w:val="HorizontalLine"/>
-        <w:bidi w:val="0"/>
-        <w:jc w:val="left"/>
-        <w:rPr/>
-      </w:pPr>
-      <w:r>
-        <w:rPr/>
+        <w:t xml:space="preserve"> 1–2 elaborati grafici raccolti nel Diario visivo + link o codice della mappa.</w:t>
       </w:r>
     </w:p>
     <w:p>
@@ -2252,7 +2428,7 @@
         <w:pStyle w:val="BodyText"/>
         <w:numPr>
           <w:ilvl w:val="0"/>
-          <w:numId w:val="13"/>
+          <w:numId w:val="14"/>
         </w:numPr>
         <w:tabs>
           <w:tab w:val="clear" w:pos="709"/>
@@ -2273,14 +2449,13 @@
         <w:pStyle w:val="BodyText"/>
         <w:numPr>
           <w:ilvl w:val="0"/>
-          <w:numId w:val="13"/>
+          <w:numId w:val="14"/>
         </w:numPr>
         <w:tabs>
           <w:tab w:val="clear" w:pos="709"/>
           <w:tab w:val="left" w:pos="709" w:leader="none"/>
         </w:tabs>
         <w:bidi w:val="0"/>
-        <w:spacing w:before="0" w:after="0"/>
         <w:ind w:hanging="283" w:left="709"/>
         <w:jc w:val="left"/>
         <w:rPr/>
@@ -2295,7 +2470,7 @@
         <w:pStyle w:val="BodyText"/>
         <w:numPr>
           <w:ilvl w:val="1"/>
-          <w:numId w:val="13"/>
+          <w:numId w:val="14"/>
         </w:numPr>
         <w:tabs>
           <w:tab w:val="clear" w:pos="709"/>
@@ -2316,7 +2491,7 @@
         <w:pStyle w:val="BodyText"/>
         <w:numPr>
           <w:ilvl w:val="1"/>
-          <w:numId w:val="13"/>
+          <w:numId w:val="14"/>
         </w:numPr>
         <w:tabs>
           <w:tab w:val="clear" w:pos="709"/>
@@ -2337,7 +2512,7 @@
         <w:pStyle w:val="BodyText"/>
         <w:numPr>
           <w:ilvl w:val="1"/>
-          <w:numId w:val="13"/>
+          <w:numId w:val="14"/>
         </w:numPr>
         <w:tabs>
           <w:tab w:val="clear" w:pos="709"/>
@@ -2350,6 +2525,27 @@
       </w:pPr>
       <w:r>
         <w:rPr/>
+        <w:t>Voci dalla classe</w:t>
+      </w:r>
+    </w:p>
+    <w:p>
+      <w:pPr>
+        <w:pStyle w:val="BodyText"/>
+        <w:numPr>
+          <w:ilvl w:val="1"/>
+          <w:numId w:val="14"/>
+        </w:numPr>
+        <w:tabs>
+          <w:tab w:val="clear" w:pos="709"/>
+          <w:tab w:val="left" w:pos="1418" w:leader="none"/>
+        </w:tabs>
+        <w:bidi w:val="0"/>
+        <w:ind w:hanging="283" w:left="1418"/>
+        <w:jc w:val="left"/>
+        <w:rPr/>
+      </w:pPr>
+      <w:r>
+        <w:rPr/>
         <w:t>Mappa interattiva</w:t>
       </w:r>
     </w:p>
@@ -2358,7 +2554,7 @@
         <w:pStyle w:val="BodyText"/>
         <w:numPr>
           <w:ilvl w:val="1"/>
-          <w:numId w:val="13"/>
+          <w:numId w:val="14"/>
         </w:numPr>
         <w:tabs>
           <w:tab w:val="clear" w:pos="709"/>
@@ -2371,7 +2567,7 @@
       </w:pPr>
       <w:r>
         <w:rPr/>
-        <w:t>Contributi grafici</w:t>
+        <w:t>Contributi grafici (Diario visivo)</w:t>
       </w:r>
     </w:p>
     <w:p>
@@ -2379,7 +2575,7 @@
         <w:pStyle w:val="BodyText"/>
         <w:numPr>
           <w:ilvl w:val="1"/>
-          <w:numId w:val="13"/>
+          <w:numId w:val="14"/>
         </w:numPr>
         <w:tabs>
           <w:tab w:val="clear" w:pos="709"/>
@@ -2400,7 +2596,38 @@
         <w:pStyle w:val="BodyText"/>
         <w:numPr>
           <w:ilvl w:val="0"/>
-          <w:numId w:val="13"/>
+          <w:numId w:val="14"/>
+        </w:numPr>
+        <w:tabs>
+          <w:tab w:val="clear" w:pos="709"/>
+          <w:tab w:val="left" w:pos="709" w:leader="none"/>
+        </w:tabs>
+        <w:bidi w:val="0"/>
+        <w:ind w:hanging="283" w:left="709"/>
+        <w:jc w:val="left"/>
+        <w:rPr/>
+      </w:pPr>
+      <w:r>
+        <w:rPr/>
+        <w:t xml:space="preserve">Tutte le immagini hanno un testo alternativo (attributo </w:t>
+      </w:r>
+      <w:r>
+        <w:rPr>
+          <w:rFonts w:ascii="Liberation Mono" w:hAnsi="Liberation Mono"/>
+        </w:rPr>
+        <w:t>alt</w:t>
+      </w:r>
+      <w:r>
+        <w:rPr/>
+        <w:t>) che le descrive brevemente.</w:t>
+      </w:r>
+    </w:p>
+    <w:p>
+      <w:pPr>
+        <w:pStyle w:val="BodyText"/>
+        <w:numPr>
+          <w:ilvl w:val="0"/>
+          <w:numId w:val="14"/>
         </w:numPr>
         <w:tabs>
           <w:tab w:val="clear" w:pos="709"/>
@@ -2436,17 +2663,6 @@
     </w:p>
     <w:p>
       <w:pPr>
-        <w:pStyle w:val="HorizontalLine"/>
-        <w:bidi w:val="0"/>
-        <w:jc w:val="left"/>
-        <w:rPr/>
-      </w:pPr>
-      <w:r>
-        <w:rPr/>
-      </w:r>
-    </w:p>
-    <w:p>
-      <w:pPr>
         <w:pStyle w:val="Heading3"/>
         <w:bidi w:val="0"/>
         <w:ind w:hanging="0" w:left="0"/>
@@ -2455,7 +2671,7 @@
       </w:pPr>
       <w:r>
         <w:rPr/>
-        <w:t>Fase 6 — Presentazione e condivisione</w:t>
+        <w:t>Fase 6 — Presentazione alla classe</w:t>
       </w:r>
     </w:p>
     <w:p>
@@ -2491,7 +2707,7 @@
         <w:pStyle w:val="BodyText"/>
         <w:numPr>
           <w:ilvl w:val="0"/>
-          <w:numId w:val="14"/>
+          <w:numId w:val="15"/>
         </w:numPr>
         <w:tabs>
           <w:tab w:val="clear" w:pos="709"/>
@@ -2512,7 +2728,7 @@
         <w:pStyle w:val="BodyText"/>
         <w:numPr>
           <w:ilvl w:val="0"/>
-          <w:numId w:val="14"/>
+          <w:numId w:val="15"/>
         </w:numPr>
         <w:tabs>
           <w:tab w:val="clear" w:pos="709"/>
@@ -2533,7 +2749,7 @@
         <w:pStyle w:val="BodyText"/>
         <w:numPr>
           <w:ilvl w:val="0"/>
-          <w:numId w:val="14"/>
+          <w:numId w:val="15"/>
         </w:numPr>
         <w:tabs>
           <w:tab w:val="clear" w:pos="709"/>
@@ -2554,7 +2770,7 @@
         <w:pStyle w:val="BodyText"/>
         <w:numPr>
           <w:ilvl w:val="0"/>
-          <w:numId w:val="14"/>
+          <w:numId w:val="15"/>
         </w:numPr>
         <w:tabs>
           <w:tab w:val="clear" w:pos="709"/>
@@ -2572,13 +2788,199 @@
     </w:p>
     <w:p>
       <w:pPr>
-        <w:pStyle w:val="HorizontalLine"/>
-        <w:bidi w:val="0"/>
-        <w:jc w:val="left"/>
-        <w:rPr/>
-      </w:pPr>
-      <w:r>
-        <w:rPr/>
+        <w:pStyle w:val="Heading3"/>
+        <w:numPr>
+          <w:ilvl w:val="0"/>
+          <w:numId w:val="0"/>
+        </w:numPr>
+        <w:bidi w:val="0"/>
+        <w:ind w:hanging="0" w:left="0"/>
+        <w:jc w:val="left"/>
+        <w:rPr/>
+      </w:pPr>
+      <w:r>
+        <w:rPr/>
+        <w:t>Fase 7 — Restituzione alla comunità</w:t>
+      </w:r>
+    </w:p>
+    <w:p>
+      <w:pPr>
+        <w:pStyle w:val="BodyText"/>
+        <w:bidi w:val="0"/>
+        <w:jc w:val="left"/>
+        <w:rPr/>
+      </w:pPr>
+      <w:r>
+        <w:rPr>
+          <w:b/>
+        </w:rPr>
+        <w:t>Durata:</w:t>
+      </w:r>
+      <w:r>
+        <w:rPr/>
+        <w:t xml:space="preserve"> 2 ore (+ eventuale evento fuori orario) | </w:t>
+      </w:r>
+      <w:r>
+        <w:rPr>
+          <w:b/>
+        </w:rPr>
+        <w:t>Discipline:</w:t>
+      </w:r>
+      <w:r>
+        <w:rPr/>
+        <w:t xml:space="preserve"> Italiano, Ed. Civica</w:t>
+      </w:r>
+    </w:p>
+    <w:p>
+      <w:pPr>
+        <w:pStyle w:val="BodyText"/>
+        <w:numPr>
+          <w:ilvl w:val="0"/>
+          <w:numId w:val="16"/>
+        </w:numPr>
+        <w:tabs>
+          <w:tab w:val="clear" w:pos="709"/>
+          <w:tab w:val="left" w:pos="709" w:leader="none"/>
+        </w:tabs>
+        <w:bidi w:val="0"/>
+        <w:spacing w:before="0" w:after="0"/>
+        <w:ind w:hanging="283" w:left="709"/>
+        <w:jc w:val="left"/>
+        <w:rPr/>
+      </w:pPr>
+      <w:r>
+        <w:rPr/>
+        <w:t xml:space="preserve">La classe sceglie insieme </w:t>
+      </w:r>
+      <w:r>
+        <w:rPr>
+          <w:b/>
+        </w:rPr>
+        <w:t>una</w:t>
+      </w:r>
+      <w:r>
+        <w:rPr/>
+        <w:t xml:space="preserve"> forma di restituzione (deliberata a inizio percorso, in Fase 1, così da poterla preparare):</w:t>
+      </w:r>
+    </w:p>
+    <w:p>
+      <w:pPr>
+        <w:pStyle w:val="BodyText"/>
+        <w:numPr>
+          <w:ilvl w:val="1"/>
+          <w:numId w:val="16"/>
+        </w:numPr>
+        <w:tabs>
+          <w:tab w:val="clear" w:pos="709"/>
+          <w:tab w:val="left" w:pos="1418" w:leader="none"/>
+        </w:tabs>
+        <w:bidi w:val="0"/>
+        <w:ind w:hanging="283" w:left="1418"/>
+        <w:jc w:val="left"/>
+        <w:rPr/>
+      </w:pPr>
+      <w:r>
+        <w:rPr>
+          <w:b/>
+        </w:rPr>
+        <w:t>Lettera al Sindaco e all'Ufficio Toponomastica</w:t>
+      </w:r>
+      <w:r>
+        <w:rPr/>
+        <w:t xml:space="preserve"> del Comune, che presenta il lavoro svolto e il link alla pagina, con eventuale proposta (es. una targhetta QR nella via);</w:t>
+      </w:r>
+    </w:p>
+    <w:p>
+      <w:pPr>
+        <w:pStyle w:val="BodyText"/>
+        <w:numPr>
+          <w:ilvl w:val="1"/>
+          <w:numId w:val="16"/>
+        </w:numPr>
+        <w:tabs>
+          <w:tab w:val="clear" w:pos="709"/>
+          <w:tab w:val="left" w:pos="1418" w:leader="none"/>
+        </w:tabs>
+        <w:bidi w:val="0"/>
+        <w:ind w:hanging="283" w:left="1418"/>
+        <w:jc w:val="left"/>
+        <w:rPr/>
+      </w:pPr>
+      <w:r>
+        <w:rPr>
+          <w:b/>
+        </w:rPr>
+        <w:t>Mostra di via</w:t>
+      </w:r>
+      <w:r>
+        <w:rPr/>
+        <w:t>: esposizione dei Diari visivi e lettura dei testi, aperta alle famiglie e — se possibile — ai residenti e ai commercianti intervistati;</w:t>
+      </w:r>
+    </w:p>
+    <w:p>
+      <w:pPr>
+        <w:pStyle w:val="BodyText"/>
+        <w:numPr>
+          <w:ilvl w:val="1"/>
+          <w:numId w:val="16"/>
+        </w:numPr>
+        <w:tabs>
+          <w:tab w:val="clear" w:pos="709"/>
+          <w:tab w:val="left" w:pos="1418" w:leader="none"/>
+        </w:tabs>
+        <w:bidi w:val="0"/>
+        <w:ind w:hanging="283" w:left="1418"/>
+        <w:jc w:val="left"/>
+        <w:rPr/>
+      </w:pPr>
+      <w:r>
+        <w:rPr>
+          <w:b/>
+        </w:rPr>
+        <w:t>Invio alla Pro Loco / biblioteca comunale</w:t>
+      </w:r>
+      <w:r>
+        <w:rPr/>
+        <w:t xml:space="preserve"> con richiesta di inserire il link tra le risorse sul territorio.</w:t>
+      </w:r>
+    </w:p>
+    <w:p>
+      <w:pPr>
+        <w:pStyle w:val="BodyText"/>
+        <w:numPr>
+          <w:ilvl w:val="0"/>
+          <w:numId w:val="16"/>
+        </w:numPr>
+        <w:tabs>
+          <w:tab w:val="clear" w:pos="709"/>
+          <w:tab w:val="left" w:pos="709" w:leader="none"/>
+        </w:tabs>
+        <w:bidi w:val="0"/>
+        <w:ind w:hanging="283" w:left="709"/>
+        <w:jc w:val="left"/>
+        <w:rPr/>
+      </w:pPr>
+      <w:r>
+        <w:rPr/>
+        <w:t>Gli alunni scrivono collettivamente il testo della restituzione (la lettera, l'invito, la mail di presentazione): è un secondo testo reale, con destinatario reale.</w:t>
+      </w:r>
+    </w:p>
+    <w:p>
+      <w:pPr>
+        <w:pStyle w:val="BodyText"/>
+        <w:bidi w:val="0"/>
+        <w:jc w:val="left"/>
+        <w:rPr/>
+      </w:pPr>
+      <w:r>
+        <w:rPr>
+          <w:b/>
+        </w:rPr>
+        <w:t>Prodotto di fase:</w:t>
+      </w:r>
+      <w:r>
+        <w:rPr/>
+        <w:t xml:space="preserve"> lettera protocollata / evento realizzato / conferma di pubblicazione da parte dell'ente, documentati con una foto o una riga nella pagina web ("Questo lavoro è stato presentato a…").</w:t>
       </w:r>
     </w:p>
     <w:p>
@@ -2631,7 +3033,7 @@
         <w:pStyle w:val="BodyText"/>
         <w:numPr>
           <w:ilvl w:val="0"/>
-          <w:numId w:val="15"/>
+          <w:numId w:val="17"/>
         </w:numPr>
         <w:tabs>
           <w:tab w:val="clear" w:pos="709"/>
@@ -2652,7 +3054,7 @@
         <w:pStyle w:val="BodyText"/>
         <w:numPr>
           <w:ilvl w:val="0"/>
-          <w:numId w:val="15"/>
+          <w:numId w:val="17"/>
         </w:numPr>
         <w:tabs>
           <w:tab w:val="clear" w:pos="709"/>
@@ -2673,7 +3075,7 @@
         <w:pStyle w:val="BodyText"/>
         <w:numPr>
           <w:ilvl w:val="0"/>
-          <w:numId w:val="15"/>
+          <w:numId w:val="17"/>
         </w:numPr>
         <w:tabs>
           <w:tab w:val="clear" w:pos="709"/>
@@ -2694,7 +3096,7 @@
         <w:pStyle w:val="BodyText"/>
         <w:numPr>
           <w:ilvl w:val="0"/>
-          <w:numId w:val="15"/>
+          <w:numId w:val="17"/>
         </w:numPr>
         <w:tabs>
           <w:tab w:val="clear" w:pos="709"/>
@@ -2715,7 +3117,7 @@
         <w:pStyle w:val="BodyText"/>
         <w:numPr>
           <w:ilvl w:val="0"/>
-          <w:numId w:val="15"/>
+          <w:numId w:val="17"/>
         </w:numPr>
         <w:tabs>
           <w:tab w:val="clear" w:pos="709"/>
@@ -2733,13 +3135,288 @@
     </w:p>
     <w:p>
       <w:pPr>
-        <w:pStyle w:val="HorizontalLine"/>
-        <w:bidi w:val="0"/>
-        <w:jc w:val="left"/>
-        <w:rPr/>
-      </w:pPr>
-      <w:r>
-        <w:rPr/>
+        <w:pStyle w:val="Heading2"/>
+        <w:numPr>
+          <w:ilvl w:val="0"/>
+          <w:numId w:val="0"/>
+        </w:numPr>
+        <w:bidi w:val="0"/>
+        <w:ind w:hanging="0" w:left="0"/>
+        <w:jc w:val="left"/>
+        <w:rPr/>
+      </w:pPr>
+      <w:r>
+        <w:rPr/>
+        <w:t>SEZIONE 6-bis — Personalizzazione e inclusione (BES e disabilità)</w:t>
+      </w:r>
+    </w:p>
+    <w:p>
+      <w:pPr>
+        <w:pStyle w:val="BlockQuotation"/>
+        <w:bidi w:val="0"/>
+        <w:jc w:val="left"/>
+        <w:rPr/>
+      </w:pPr>
+      <w:r>
+        <w:rPr/>
+        <w:t>Riferimenti: L. 104/1992; D.Lgs. 66/2017 e D.Lgs. 96/2019; D.I. 182/2020 (PEI); L. 170/2010 e D.M. 5669/2011 (DSA); D.M. 27/12/2012 e C.M. 8/2013 (BES).</w:t>
+      </w:r>
+    </w:p>
+    <w:p>
+      <w:pPr>
+        <w:pStyle w:val="BodyText"/>
+        <w:bidi w:val="0"/>
+        <w:jc w:val="left"/>
+        <w:rPr/>
+      </w:pPr>
+      <w:r>
+        <w:rPr/>
+        <w:t>Via Per Via è strutturalmente inclusivo perché la scelta è libera, la profondità adattabile e ogni contributo è valido: questo paragrafo traduce il principio in strumenti operativi, da raccordare con PEI e PDP degli alunni coinvolti.</w:t>
+      </w:r>
+    </w:p>
+    <w:p>
+      <w:pPr>
+        <w:pStyle w:val="BodyText"/>
+        <w:numPr>
+          <w:ilvl w:val="0"/>
+          <w:numId w:val="18"/>
+        </w:numPr>
+        <w:tabs>
+          <w:tab w:val="clear" w:pos="709"/>
+          <w:tab w:val="left" w:pos="709" w:leader="none"/>
+        </w:tabs>
+        <w:bidi w:val="0"/>
+        <w:spacing w:before="0" w:after="0"/>
+        <w:ind w:hanging="283" w:left="709"/>
+        <w:jc w:val="left"/>
+        <w:rPr/>
+      </w:pPr>
+      <w:r>
+        <w:rPr>
+          <w:b/>
+        </w:rPr>
+        <w:t>Formati alternativi del testo "...per via"</w:t>
+      </w:r>
+      <w:r>
+        <w:rPr/>
+        <w:t xml:space="preserve"> (equivalenti a tutti gli effetti, da indicare nel PEI/PDP come modalità di verifica personalizzata):</w:t>
+      </w:r>
+    </w:p>
+    <w:p>
+      <w:pPr>
+        <w:pStyle w:val="BodyText"/>
+        <w:numPr>
+          <w:ilvl w:val="1"/>
+          <w:numId w:val="18"/>
+        </w:numPr>
+        <w:tabs>
+          <w:tab w:val="clear" w:pos="709"/>
+          <w:tab w:val="left" w:pos="1418" w:leader="none"/>
+        </w:tabs>
+        <w:bidi w:val="0"/>
+        <w:ind w:hanging="283" w:left="1418"/>
+        <w:jc w:val="left"/>
+        <w:rPr/>
+      </w:pPr>
+      <w:r>
+        <w:rPr>
+          <w:b/>
+        </w:rPr>
+        <w:t>audio</w:t>
+      </w:r>
+      <w:r>
+        <w:rPr/>
+        <w:t>: il testo registrato con la propria voce (anche a partire da una scaletta), pubblicato come traccia nella pagina;</w:t>
+      </w:r>
+    </w:p>
+    <w:p>
+      <w:pPr>
+        <w:pStyle w:val="BodyText"/>
+        <w:numPr>
+          <w:ilvl w:val="1"/>
+          <w:numId w:val="18"/>
+        </w:numPr>
+        <w:tabs>
+          <w:tab w:val="clear" w:pos="709"/>
+          <w:tab w:val="left" w:pos="1418" w:leader="none"/>
+        </w:tabs>
+        <w:bidi w:val="0"/>
+        <w:ind w:hanging="283" w:left="1418"/>
+        <w:jc w:val="left"/>
+        <w:rPr/>
+      </w:pPr>
+      <w:r>
+        <w:rPr>
+          <w:b/>
+        </w:rPr>
+        <w:t>mappa visuale</w:t>
+      </w:r>
+      <w:r>
+        <w:rPr/>
+        <w:t>: mappa concettuale o storyboard illustrato che organizza le informazioni per immagini e parole-chiave;</w:t>
+      </w:r>
+    </w:p>
+    <w:p>
+      <w:pPr>
+        <w:pStyle w:val="BodyText"/>
+        <w:numPr>
+          <w:ilvl w:val="1"/>
+          <w:numId w:val="18"/>
+        </w:numPr>
+        <w:tabs>
+          <w:tab w:val="clear" w:pos="709"/>
+          <w:tab w:val="left" w:pos="1418" w:leader="none"/>
+        </w:tabs>
+        <w:bidi w:val="0"/>
+        <w:ind w:hanging="283" w:left="1418"/>
+        <w:jc w:val="left"/>
+        <w:rPr/>
+      </w:pPr>
+      <w:r>
+        <w:rPr>
+          <w:b/>
+        </w:rPr>
+        <w:t>contributo fotografico come prodotto principale</w:t>
+      </w:r>
+      <w:r>
+        <w:rPr/>
+        <w:t>: un racconto per immagini della via (8–12 foto con didascalie brevi), in cui il testo scritto si riduce alle didascalie;</w:t>
+      </w:r>
+    </w:p>
+    <w:p>
+      <w:pPr>
+        <w:pStyle w:val="BodyText"/>
+        <w:numPr>
+          <w:ilvl w:val="1"/>
+          <w:numId w:val="18"/>
+        </w:numPr>
+        <w:tabs>
+          <w:tab w:val="clear" w:pos="709"/>
+          <w:tab w:val="left" w:pos="1418" w:leader="none"/>
+        </w:tabs>
+        <w:bidi w:val="0"/>
+        <w:ind w:hanging="283" w:left="1418"/>
+        <w:jc w:val="left"/>
+        <w:rPr/>
+      </w:pPr>
+      <w:r>
+        <w:rPr>
+          <w:b/>
+        </w:rPr>
+        <w:t>testo facilitato</w:t>
+      </w:r>
+      <w:r>
+        <w:rPr/>
+        <w:t>: struttura a domande-guida (Chi? Quando? Perché questa via?), frasi brevi, supporto di un compagno tutor o del docente.</w:t>
+      </w:r>
+    </w:p>
+    <w:p>
+      <w:pPr>
+        <w:pStyle w:val="BodyText"/>
+        <w:numPr>
+          <w:ilvl w:val="0"/>
+          <w:numId w:val="18"/>
+        </w:numPr>
+        <w:tabs>
+          <w:tab w:val="clear" w:pos="709"/>
+          <w:tab w:val="left" w:pos="709" w:leader="none"/>
+        </w:tabs>
+        <w:bidi w:val="0"/>
+        <w:ind w:hanging="283" w:left="709"/>
+        <w:jc w:val="left"/>
+        <w:rPr/>
+      </w:pPr>
+      <w:r>
+        <w:rPr>
+          <w:b/>
+        </w:rPr>
+        <w:t>Ruoli differenziati nel gruppo</w:t>
+      </w:r>
+      <w:r>
+        <w:rPr/>
+        <w:t>: fotografo di via, cartografo (mappa e coordinate), intervistatore, illustratore del Diario visivo, ricercatore di fonti, curatore della pagina. Ogni ruolo produce una parte visibile e firmata del risultato: nessuno "aiuta soltanto", tutti firmano.</w:t>
+      </w:r>
+    </w:p>
+    <w:p>
+      <w:pPr>
+        <w:pStyle w:val="BodyText"/>
+        <w:numPr>
+          <w:ilvl w:val="0"/>
+          <w:numId w:val="18"/>
+        </w:numPr>
+        <w:tabs>
+          <w:tab w:val="clear" w:pos="709"/>
+          <w:tab w:val="left" w:pos="709" w:leader="none"/>
+        </w:tabs>
+        <w:bidi w:val="0"/>
+        <w:ind w:hanging="283" w:left="709"/>
+        <w:jc w:val="left"/>
+        <w:rPr/>
+      </w:pPr>
+      <w:r>
+        <w:rPr>
+          <w:b/>
+        </w:rPr>
+        <w:t>Strumenti compensativi</w:t>
+      </w:r>
+      <w:r>
+        <w:rPr/>
+        <w:t xml:space="preserve"> ammessi in ogni fase: sintesi vocale e dettatura, mappe e scalette, correttore ortografico, tempi aggiuntivi; </w:t>
+      </w:r>
+      <w:r>
+        <w:rPr>
+          <w:b/>
+        </w:rPr>
+        <w:t>misure dispensative</w:t>
+      </w:r>
+      <w:r>
+        <w:rPr/>
+        <w:t xml:space="preserve"> coerenti con il PDP (es. dispensa dalla lettura ad alta voce in presentazione, sostituita da supporto visivo).</w:t>
+      </w:r>
+    </w:p>
+    <w:p>
+      <w:pPr>
+        <w:pStyle w:val="BodyText"/>
+        <w:numPr>
+          <w:ilvl w:val="0"/>
+          <w:numId w:val="18"/>
+        </w:numPr>
+        <w:tabs>
+          <w:tab w:val="clear" w:pos="709"/>
+          <w:tab w:val="left" w:pos="709" w:leader="none"/>
+        </w:tabs>
+        <w:bidi w:val="0"/>
+        <w:ind w:hanging="283" w:left="709"/>
+        <w:jc w:val="left"/>
+        <w:rPr/>
+      </w:pPr>
+      <w:r>
+        <w:rPr>
+          <w:b/>
+        </w:rPr>
+        <w:t>Valutazione</w:t>
+      </w:r>
+      <w:r>
+        <w:rPr/>
+        <w:t>: le rubriche si applicano al formato scelto (la rubrica del testo vale per l'audio e per le didascalie del racconto fotografico, con gli stessi indicatori: accuratezza, rielaborazione, chiarezza, fonti). L'obiettivo resta identico per tutti: raccontare con parole — o immagini — proprie.</w:t>
+      </w:r>
+    </w:p>
+    <w:p>
+      <w:pPr>
+        <w:pStyle w:val="BodyText"/>
+        <w:bidi w:val="0"/>
+        <w:jc w:val="left"/>
+        <w:rPr/>
+      </w:pPr>
+      <w:r>
+        <w:rPr>
+          <w:b/>
+        </w:rPr>
+        <w:t>Primaria:</w:t>
+      </w:r>
+      <w:r>
+        <w:rPr/>
+        <w:t xml:space="preserve"> privilegiare il lavoro in coppia con tutor tra pari; il racconto fotografico e la mappa visuale sono opzioni aperte a tutta la classe, non "riservate", per evitare effetti di etichettamento.</w:t>
       </w:r>
     </w:p>
     <w:p>
@@ -2782,9 +3459,9 @@
         </w:tblCellMar>
       </w:tblPr>
       <w:tblGrid>
-        <w:gridCol w:w="4416"/>
-        <w:gridCol w:w="3466"/>
-        <w:gridCol w:w="1755"/>
+        <w:gridCol w:w="4360"/>
+        <w:gridCol w:w="3578"/>
+        <w:gridCol w:w="1699"/>
       </w:tblGrid>
       <w:tr>
         <w:trPr>
@@ -2792,7 +3469,7 @@
         </w:trPr>
         <w:tc>
           <w:tcPr>
-            <w:tcW w:w="4416" w:type="dxa"/>
+            <w:tcW w:w="4360" w:type="dxa"/>
             <w:tcBorders>
               <w:top w:val="single" w:sz="4" w:space="0" w:color="000000"/>
               <w:left w:val="single" w:sz="4" w:space="0" w:color="000000"/>
@@ -2814,7 +3491,7 @@
         </w:tc>
         <w:tc>
           <w:tcPr>
-            <w:tcW w:w="3466" w:type="dxa"/>
+            <w:tcW w:w="3578" w:type="dxa"/>
             <w:tcBorders>
               <w:top w:val="single" w:sz="4" w:space="0" w:color="000000"/>
               <w:left w:val="single" w:sz="4" w:space="0" w:color="000000"/>
@@ -2836,7 +3513,7 @@
         </w:tc>
         <w:tc>
           <w:tcPr>
-            <w:tcW w:w="1755" w:type="dxa"/>
+            <w:tcW w:w="1699" w:type="dxa"/>
             <w:tcBorders>
               <w:top w:val="single" w:sz="4" w:space="0" w:color="000000"/>
               <w:left w:val="single" w:sz="4" w:space="0" w:color="000000"/>
@@ -2862,7 +3539,7 @@
         <w:trPr/>
         <w:tc>
           <w:tcPr>
-            <w:tcW w:w="4416" w:type="dxa"/>
+            <w:tcW w:w="4360" w:type="dxa"/>
             <w:tcBorders>
               <w:left w:val="single" w:sz="4" w:space="0" w:color="000000"/>
               <w:bottom w:val="single" w:sz="4" w:space="0" w:color="000000"/>
@@ -2883,7 +3560,7 @@
         </w:tc>
         <w:tc>
           <w:tcPr>
-            <w:tcW w:w="3466" w:type="dxa"/>
+            <w:tcW w:w="3578" w:type="dxa"/>
             <w:tcBorders>
               <w:left w:val="single" w:sz="4" w:space="0" w:color="000000"/>
               <w:bottom w:val="single" w:sz="4" w:space="0" w:color="000000"/>
@@ -2904,7 +3581,7 @@
         </w:tc>
         <w:tc>
           <w:tcPr>
-            <w:tcW w:w="1755" w:type="dxa"/>
+            <w:tcW w:w="1699" w:type="dxa"/>
             <w:tcBorders>
               <w:left w:val="single" w:sz="4" w:space="0" w:color="000000"/>
               <w:bottom w:val="single" w:sz="4" w:space="0" w:color="000000"/>
@@ -2920,7 +3597,7 @@
             </w:pPr>
             <w:r>
               <w:rPr/>
-              <w:t>40%</w:t>
+              <w:t>35%</w:t>
             </w:r>
           </w:p>
         </w:tc>
@@ -2929,7 +3606,7 @@
         <w:trPr/>
         <w:tc>
           <w:tcPr>
-            <w:tcW w:w="4416" w:type="dxa"/>
+            <w:tcW w:w="4360" w:type="dxa"/>
             <w:tcBorders>
               <w:left w:val="single" w:sz="4" w:space="0" w:color="000000"/>
               <w:bottom w:val="single" w:sz="4" w:space="0" w:color="000000"/>
@@ -2950,7 +3627,7 @@
         </w:tc>
         <w:tc>
           <w:tcPr>
-            <w:tcW w:w="3466" w:type="dxa"/>
+            <w:tcW w:w="3578" w:type="dxa"/>
             <w:tcBorders>
               <w:left w:val="single" w:sz="4" w:space="0" w:color="000000"/>
               <w:bottom w:val="single" w:sz="4" w:space="0" w:color="000000"/>
@@ -2971,7 +3648,7 @@
         </w:tc>
         <w:tc>
           <w:tcPr>
-            <w:tcW w:w="1755" w:type="dxa"/>
+            <w:tcW w:w="1699" w:type="dxa"/>
             <w:tcBorders>
               <w:left w:val="single" w:sz="4" w:space="0" w:color="000000"/>
               <w:bottom w:val="single" w:sz="4" w:space="0" w:color="000000"/>
@@ -2996,7 +3673,7 @@
         <w:trPr/>
         <w:tc>
           <w:tcPr>
-            <w:tcW w:w="4416" w:type="dxa"/>
+            <w:tcW w:w="4360" w:type="dxa"/>
             <w:tcBorders>
               <w:left w:val="single" w:sz="4" w:space="0" w:color="000000"/>
               <w:bottom w:val="single" w:sz="4" w:space="0" w:color="000000"/>
@@ -3017,7 +3694,7 @@
         </w:tc>
         <w:tc>
           <w:tcPr>
-            <w:tcW w:w="3466" w:type="dxa"/>
+            <w:tcW w:w="3578" w:type="dxa"/>
             <w:tcBorders>
               <w:left w:val="single" w:sz="4" w:space="0" w:color="000000"/>
               <w:bottom w:val="single" w:sz="4" w:space="0" w:color="000000"/>
@@ -3038,7 +3715,7 @@
         </w:tc>
         <w:tc>
           <w:tcPr>
-            <w:tcW w:w="1755" w:type="dxa"/>
+            <w:tcW w:w="1699" w:type="dxa"/>
             <w:tcBorders>
               <w:left w:val="single" w:sz="4" w:space="0" w:color="000000"/>
               <w:bottom w:val="single" w:sz="4" w:space="0" w:color="000000"/>
@@ -3054,7 +3731,7 @@
             </w:pPr>
             <w:r>
               <w:rPr/>
-              <w:t>20%</w:t>
+              <w:t>15%</w:t>
             </w:r>
           </w:p>
         </w:tc>
@@ -3063,7 +3740,7 @@
         <w:trPr/>
         <w:tc>
           <w:tcPr>
-            <w:tcW w:w="4416" w:type="dxa"/>
+            <w:tcW w:w="4360" w:type="dxa"/>
             <w:tcBorders>
               <w:left w:val="single" w:sz="4" w:space="0" w:color="000000"/>
               <w:bottom w:val="single" w:sz="4" w:space="0" w:color="000000"/>
@@ -3084,7 +3761,7 @@
         </w:tc>
         <w:tc>
           <w:tcPr>
-            <w:tcW w:w="3466" w:type="dxa"/>
+            <w:tcW w:w="3578" w:type="dxa"/>
             <w:tcBorders>
               <w:left w:val="single" w:sz="4" w:space="0" w:color="000000"/>
               <w:bottom w:val="single" w:sz="4" w:space="0" w:color="000000"/>
@@ -3105,7 +3782,7 @@
         </w:tc>
         <w:tc>
           <w:tcPr>
-            <w:tcW w:w="1755" w:type="dxa"/>
+            <w:tcW w:w="1699" w:type="dxa"/>
             <w:tcBorders>
               <w:left w:val="single" w:sz="4" w:space="0" w:color="000000"/>
               <w:bottom w:val="single" w:sz="4" w:space="0" w:color="000000"/>
@@ -3122,6 +3799,73 @@
             <w:r>
               <w:rPr/>
               <w:t>15%</w:t>
+            </w:r>
+          </w:p>
+        </w:tc>
+      </w:tr>
+      <w:tr>
+        <w:trPr/>
+        <w:tc>
+          <w:tcPr>
+            <w:tcW w:w="4360" w:type="dxa"/>
+            <w:tcBorders>
+              <w:left w:val="single" w:sz="4" w:space="0" w:color="000000"/>
+              <w:bottom w:val="single" w:sz="4" w:space="0" w:color="000000"/>
+            </w:tcBorders>
+          </w:tcPr>
+          <w:p>
+            <w:pPr>
+              <w:pStyle w:val="TableContents"/>
+              <w:bidi w:val="0"/>
+              <w:jc w:val="left"/>
+              <w:rPr/>
+            </w:pPr>
+            <w:r>
+              <w:rPr/>
+              <w:t>Restituzione alla comunità (partecipazione, cura del testo di presentazione)</w:t>
+            </w:r>
+          </w:p>
+        </w:tc>
+        <w:tc>
+          <w:tcPr>
+            <w:tcW w:w="3578" w:type="dxa"/>
+            <w:tcBorders>
+              <w:left w:val="single" w:sz="4" w:space="0" w:color="000000"/>
+              <w:bottom w:val="single" w:sz="4" w:space="0" w:color="000000"/>
+            </w:tcBorders>
+          </w:tcPr>
+          <w:p>
+            <w:pPr>
+              <w:pStyle w:val="TableContents"/>
+              <w:bidi w:val="0"/>
+              <w:jc w:val="left"/>
+              <w:rPr/>
+            </w:pPr>
+            <w:r>
+              <w:rPr/>
+              <w:t>Osservazione + prodotto</w:t>
+            </w:r>
+          </w:p>
+        </w:tc>
+        <w:tc>
+          <w:tcPr>
+            <w:tcW w:w="1699" w:type="dxa"/>
+            <w:tcBorders>
+              <w:left w:val="single" w:sz="4" w:space="0" w:color="000000"/>
+              <w:bottom w:val="single" w:sz="4" w:space="0" w:color="000000"/>
+              <w:right w:val="single" w:sz="4" w:space="0" w:color="000000"/>
+            </w:tcBorders>
+          </w:tcPr>
+          <w:p>
+            <w:pPr>
+              <w:pStyle w:val="TableContents"/>
+              <w:bidi w:val="0"/>
+              <w:jc w:val="left"/>
+              <w:rPr/>
+            </w:pPr>
+            <w:r>
+              <w:rPr/>
+              <w:t>10%</w:t>
             </w:r>
           </w:p>
         </w:tc>
@@ -3136,6 +3880,18 @@
       </w:pPr>
       <w:r>
         <w:rPr/>
+      </w:r>
+    </w:p>
+    <w:p>
+      <w:pPr>
+        <w:pStyle w:val="BodyText"/>
+        <w:bidi w:val="0"/>
+        <w:jc w:val="left"/>
+        <w:rPr/>
+      </w:pPr>
+      <w:r>
+        <w:rPr/>
+        <w:t>Nel livello Avanzato dell'indicatore di completezza della pagina web rientrano anche il testo alternativo su tutte le immagini e la presenza delle «voci dalla classe»; nel livello Base la loro assenza o genericità.</w:t>
       </w:r>
     </w:p>
     <w:p>
@@ -3745,6 +4501,276 @@
       </w:pPr>
       <w:r>
         <w:rPr/>
+        <w:t>Rubrica — Diario visivo</w:t>
+      </w:r>
+    </w:p>
+    <w:tbl>
+      <w:tblPr>
+        <w:tblW w:w="5000" w:type="pct"/>
+        <w:jc w:val="left"/>
+        <w:tblInd w:w="55" w:type="dxa"/>
+        <w:tblLayout w:type="fixed"/>
+        <w:tblCellMar>
+          <w:top w:w="55" w:type="dxa"/>
+          <w:left w:w="55" w:type="dxa"/>
+          <w:bottom w:w="55" w:type="dxa"/>
+          <w:right w:w="55" w:type="dxa"/>
+        </w:tblCellMar>
+      </w:tblPr>
+      <w:tblGrid>
+        <w:gridCol w:w="1927"/>
+        <w:gridCol w:w="1928"/>
+        <w:gridCol w:w="1927"/>
+        <w:gridCol w:w="1928"/>
+        <w:gridCol w:w="1928"/>
+      </w:tblGrid>
+      <w:tr>
+        <w:trPr>
+          <w:tblHeader w:val="true"/>
+        </w:trPr>
+        <w:tc>
+          <w:tcPr>
+            <w:tcW w:w="1927" w:type="dxa"/>
+            <w:tcBorders>
+              <w:top w:val="single" w:sz="4" w:space="0" w:color="000000"/>
+              <w:left w:val="single" w:sz="4" w:space="0" w:color="000000"/>
+              <w:bottom w:val="single" w:sz="4" w:space="0" w:color="000000"/>
+            </w:tcBorders>
+          </w:tcPr>
+          <w:p>
+            <w:pPr>
+              <w:pStyle w:val="TableHeading"/>
+              <w:bidi w:val="0"/>
+              <w:jc w:val="left"/>
+              <w:rPr/>
+            </w:pPr>
+            <w:r>
+              <w:rPr/>
+              <w:t>Indicatore</w:t>
+            </w:r>
+          </w:p>
+        </w:tc>
+        <w:tc>
+          <w:tcPr>
+            <w:tcW w:w="1928" w:type="dxa"/>
+            <w:tcBorders>
+              <w:top w:val="single" w:sz="4" w:space="0" w:color="000000"/>
+              <w:left w:val="single" w:sz="4" w:space="0" w:color="000000"/>
+              <w:bottom w:val="single" w:sz="4" w:space="0" w:color="000000"/>
+            </w:tcBorders>
+          </w:tcPr>
+          <w:p>
+            <w:pPr>
+              <w:pStyle w:val="TableHeading"/>
+              <w:bidi w:val="0"/>
+              <w:jc w:val="left"/>
+              <w:rPr/>
+            </w:pPr>
+            <w:r>
+              <w:rPr/>
+              <w:t>Avanzato</w:t>
+            </w:r>
+          </w:p>
+        </w:tc>
+        <w:tc>
+          <w:tcPr>
+            <w:tcW w:w="1927" w:type="dxa"/>
+            <w:tcBorders>
+              <w:top w:val="single" w:sz="4" w:space="0" w:color="000000"/>
+              <w:left w:val="single" w:sz="4" w:space="0" w:color="000000"/>
+              <w:bottom w:val="single" w:sz="4" w:space="0" w:color="000000"/>
+            </w:tcBorders>
+          </w:tcPr>
+          <w:p>
+            <w:pPr>
+              <w:pStyle w:val="TableHeading"/>
+              <w:bidi w:val="0"/>
+              <w:jc w:val="left"/>
+              <w:rPr/>
+            </w:pPr>
+            <w:r>
+              <w:rPr/>
+              <w:t>Intermedio</w:t>
+            </w:r>
+          </w:p>
+        </w:tc>
+        <w:tc>
+          <w:tcPr>
+            <w:tcW w:w="1928" w:type="dxa"/>
+            <w:tcBorders>
+              <w:top w:val="single" w:sz="4" w:space="0" w:color="000000"/>
+              <w:left w:val="single" w:sz="4" w:space="0" w:color="000000"/>
+              <w:bottom w:val="single" w:sz="4" w:space="0" w:color="000000"/>
+            </w:tcBorders>
+          </w:tcPr>
+          <w:p>
+            <w:pPr>
+              <w:pStyle w:val="TableHeading"/>
+              <w:bidi w:val="0"/>
+              <w:jc w:val="left"/>
+              <w:rPr/>
+            </w:pPr>
+            <w:r>
+              <w:rPr/>
+              <w:t>Base</w:t>
+            </w:r>
+          </w:p>
+        </w:tc>
+        <w:tc>
+          <w:tcPr>
+            <w:tcW w:w="1928" w:type="dxa"/>
+            <w:tcBorders>
+              <w:top w:val="single" w:sz="4" w:space="0" w:color="000000"/>
+              <w:left w:val="single" w:sz="4" w:space="0" w:color="000000"/>
+              <w:bottom w:val="single" w:sz="4" w:space="0" w:color="000000"/>
+              <w:right w:val="single" w:sz="4" w:space="0" w:color="000000"/>
+            </w:tcBorders>
+          </w:tcPr>
+          <w:p>
+            <w:pPr>
+              <w:pStyle w:val="TableHeading"/>
+              <w:bidi w:val="0"/>
+              <w:jc w:val="left"/>
+              <w:rPr/>
+            </w:pPr>
+            <w:r>
+              <w:rPr/>
+              <w:t>In via di acquisizione</w:t>
+            </w:r>
+          </w:p>
+        </w:tc>
+      </w:tr>
+      <w:tr>
+        <w:trPr/>
+        <w:tc>
+          <w:tcPr>
+            <w:tcW w:w="1927" w:type="dxa"/>
+            <w:tcBorders>
+              <w:left w:val="single" w:sz="4" w:space="0" w:color="000000"/>
+              <w:bottom w:val="single" w:sz="4" w:space="0" w:color="000000"/>
+            </w:tcBorders>
+          </w:tcPr>
+          <w:p>
+            <w:pPr>
+              <w:pStyle w:val="TableContents"/>
+              <w:bidi w:val="0"/>
+              <w:jc w:val="left"/>
+              <w:rPr/>
+            </w:pPr>
+            <w:r>
+              <w:rPr/>
+              <w:t>Diario visivo</w:t>
+            </w:r>
+          </w:p>
+        </w:tc>
+        <w:tc>
+          <w:tcPr>
+            <w:tcW w:w="1928" w:type="dxa"/>
+            <w:tcBorders>
+              <w:left w:val="single" w:sz="4" w:space="0" w:color="000000"/>
+              <w:bottom w:val="single" w:sz="4" w:space="0" w:color="000000"/>
+            </w:tcBorders>
+          </w:tcPr>
+          <w:p>
+            <w:pPr>
+              <w:pStyle w:val="TableContents"/>
+              <w:bidi w:val="0"/>
+              <w:jc w:val="left"/>
+              <w:rPr/>
+            </w:pPr>
+            <w:r>
+              <w:rPr/>
+              <w:t>Elaborati originali con didascalie complete che integrano emozione, tecnica e contesto</w:t>
+            </w:r>
+          </w:p>
+        </w:tc>
+        <w:tc>
+          <w:tcPr>
+            <w:tcW w:w="1927" w:type="dxa"/>
+            <w:tcBorders>
+              <w:left w:val="single" w:sz="4" w:space="0" w:color="000000"/>
+              <w:bottom w:val="single" w:sz="4" w:space="0" w:color="000000"/>
+            </w:tcBorders>
+          </w:tcPr>
+          <w:p>
+            <w:pPr>
+              <w:pStyle w:val="TableContents"/>
+              <w:bidi w:val="0"/>
+              <w:jc w:val="left"/>
+              <w:rPr/>
+            </w:pPr>
+            <w:r>
+              <w:rPr/>
+              <w:t>Didascalie presenti ma parziali</w:t>
+            </w:r>
+          </w:p>
+        </w:tc>
+        <w:tc>
+          <w:tcPr>
+            <w:tcW w:w="1928" w:type="dxa"/>
+            <w:tcBorders>
+              <w:left w:val="single" w:sz="4" w:space="0" w:color="000000"/>
+              <w:bottom w:val="single" w:sz="4" w:space="0" w:color="000000"/>
+            </w:tcBorders>
+          </w:tcPr>
+          <w:p>
+            <w:pPr>
+              <w:pStyle w:val="TableContents"/>
+              <w:bidi w:val="0"/>
+              <w:jc w:val="left"/>
+              <w:rPr/>
+            </w:pPr>
+            <w:r>
+              <w:rPr/>
+              <w:t>Elaborati senza didascalie</w:t>
+            </w:r>
+          </w:p>
+        </w:tc>
+        <w:tc>
+          <w:tcPr>
+            <w:tcW w:w="1928" w:type="dxa"/>
+            <w:tcBorders>
+              <w:left w:val="single" w:sz="4" w:space="0" w:color="000000"/>
+              <w:bottom w:val="single" w:sz="4" w:space="0" w:color="000000"/>
+              <w:right w:val="single" w:sz="4" w:space="0" w:color="000000"/>
+            </w:tcBorders>
+          </w:tcPr>
+          <w:p>
+            <w:pPr>
+              <w:pStyle w:val="TableContents"/>
+              <w:bidi w:val="0"/>
+              <w:jc w:val="left"/>
+              <w:rPr/>
+            </w:pPr>
+            <w:r>
+              <w:rPr/>
+              <w:t>Elaborati assenti o non originali</w:t>
+            </w:r>
+          </w:p>
+        </w:tc>
+      </w:tr>
+    </w:tbl>
+    <w:p>
+      <w:pPr>
+        <w:pStyle w:val="BodyText"/>
+        <w:bidi w:val="0"/>
+        <w:jc w:val="left"/>
+        <w:rPr/>
+      </w:pPr>
+      <w:r>
+        <w:rPr/>
+      </w:r>
+    </w:p>
+    <w:p>
+      <w:pPr>
+        <w:pStyle w:val="Heading3"/>
+        <w:bidi w:val="0"/>
+        <w:ind w:hanging="0" w:left="0"/>
+        <w:jc w:val="left"/>
+        <w:rPr/>
+      </w:pPr>
+      <w:r>
+        <w:rPr/>
         <w:t>Autovalutazione alunno (scheda da consegnare a fine percorso)</w:t>
       </w:r>
     </w:p>
@@ -3753,7 +4779,7 @@
         <w:pStyle w:val="BodyText"/>
         <w:numPr>
           <w:ilvl w:val="0"/>
-          <w:numId w:val="16"/>
+          <w:numId w:val="19"/>
         </w:numPr>
         <w:tabs>
           <w:tab w:val="clear" w:pos="709"/>
@@ -3774,7 +4800,7 @@
         <w:pStyle w:val="BodyText"/>
         <w:numPr>
           <w:ilvl w:val="0"/>
-          <w:numId w:val="16"/>
+          <w:numId w:val="19"/>
         </w:numPr>
         <w:tabs>
           <w:tab w:val="clear" w:pos="709"/>
@@ -3795,7 +4821,7 @@
         <w:pStyle w:val="BodyText"/>
         <w:numPr>
           <w:ilvl w:val="0"/>
-          <w:numId w:val="16"/>
+          <w:numId w:val="19"/>
         </w:numPr>
         <w:tabs>
           <w:tab w:val="clear" w:pos="709"/>
@@ -3816,7 +4842,7 @@
         <w:pStyle w:val="BodyText"/>
         <w:numPr>
           <w:ilvl w:val="0"/>
-          <w:numId w:val="16"/>
+          <w:numId w:val="19"/>
         </w:numPr>
         <w:tabs>
           <w:tab w:val="clear" w:pos="709"/>
@@ -3834,18 +4860,11 @@
     </w:p>
     <w:p>
       <w:pPr>
-        <w:pStyle w:val="HorizontalLine"/>
-        <w:bidi w:val="0"/>
-        <w:jc w:val="left"/>
-        <w:rPr/>
-      </w:pPr>
-      <w:r>
-        <w:rPr/>
-      </w:r>
-    </w:p>
-    <w:p>
-      <w:pPr>
         <w:pStyle w:val="Heading2"/>
+        <w:numPr>
+          <w:ilvl w:val="0"/>
+          <w:numId w:val="0"/>
+        </w:numPr>
         <w:bidi w:val="0"/>
         <w:ind w:hanging="0" w:left="0"/>
         <w:jc w:val="left"/>
@@ -3861,7 +4880,7 @@
         <w:pStyle w:val="BodyText"/>
         <w:numPr>
           <w:ilvl w:val="0"/>
-          <w:numId w:val="17"/>
+          <w:numId w:val="20"/>
         </w:numPr>
         <w:tabs>
           <w:tab w:val="clear" w:pos="709"/>
@@ -3882,7 +4901,7 @@
         <w:pStyle w:val="BodyText"/>
         <w:numPr>
           <w:ilvl w:val="0"/>
-          <w:numId w:val="17"/>
+          <w:numId w:val="20"/>
         </w:numPr>
         <w:tabs>
           <w:tab w:val="clear" w:pos="709"/>
@@ -3903,7 +4922,7 @@
         <w:pStyle w:val="BodyText"/>
         <w:numPr>
           <w:ilvl w:val="0"/>
-          <w:numId w:val="17"/>
+          <w:numId w:val="20"/>
         </w:numPr>
         <w:tabs>
           <w:tab w:val="clear" w:pos="709"/>
@@ -3924,7 +4943,7 @@
         <w:pStyle w:val="BodyText"/>
         <w:numPr>
           <w:ilvl w:val="0"/>
-          <w:numId w:val="17"/>
+          <w:numId w:val="20"/>
         </w:numPr>
         <w:tabs>
           <w:tab w:val="clear" w:pos="709"/>
@@ -3938,17 +4957,6 @@
       <w:r>
         <w:rPr/>
         <w:t>Griglia di valutazione del prodotto finale</w:t>
-      </w:r>
-    </w:p>
-    <w:p>
-      <w:pPr>
-        <w:pStyle w:val="HorizontalLine"/>
-        <w:bidi w:val="0"/>
-        <w:jc w:val="left"/>
-        <w:rPr/>
-      </w:pPr>
-      <w:r>
-        <w:rPr/>
       </w:r>
     </w:p>
     <w:p>
@@ -4938,8 +5946,8 @@
   <w:abstractNum w:abstractNumId="8">
     <w:lvl w:ilvl="0">
       <w:start w:val="1"/>
-      <w:numFmt w:val="decimal"/>
-      <w:lvlText w:val="%1."/>
+      <w:numFmt w:val="bullet"/>
+      <w:lvlText w:val=""/>
       <w:lvlJc w:val="left"/>
       <w:pPr>
         <w:tabs>
@@ -4947,12 +5955,14 @@
         </w:tabs>
         <w:ind w:left="709" w:hanging="283"/>
       </w:pPr>
-      <w:rPr/>
+      <w:rPr>
+        <w:rFonts w:ascii="Symbol" w:hAnsi="Symbol" w:cs="Symbol" w:hint="default"/>
+      </w:rPr>
     </w:lvl>
     <w:lvl w:ilvl="1">
       <w:start w:val="1"/>
-      <w:numFmt w:val="decimal"/>
-      <w:lvlText w:val="%2."/>
+      <w:numFmt w:val="bullet"/>
+      <w:lvlText w:val=""/>
       <w:lvlJc w:val="left"/>
       <w:pPr>
         <w:tabs>
@@ -4960,12 +5970,14 @@
         </w:tabs>
         <w:ind w:left="1418" w:hanging="283"/>
       </w:pPr>
-      <w:rPr/>
+      <w:rPr>
+        <w:rFonts w:ascii="Symbol" w:hAnsi="Symbol" w:cs="Symbol" w:hint="default"/>
+      </w:rPr>
     </w:lvl>
     <w:lvl w:ilvl="2">
       <w:start w:val="1"/>
-      <w:numFmt w:val="decimal"/>
-      <w:lvlText w:val="%3."/>
+      <w:numFmt w:val="bullet"/>
+      <w:lvlText w:val=""/>
       <w:lvlJc w:val="left"/>
       <w:pPr>
         <w:tabs>
@@ -4973,12 +5985,14 @@
         </w:tabs>
         <w:ind w:left="2127" w:hanging="283"/>
       </w:pPr>
-      <w:rPr/>
+      <w:rPr>
+        <w:rFonts w:ascii="Symbol" w:hAnsi="Symbol" w:cs="Symbol" w:hint="default"/>
+      </w:rPr>
     </w:lvl>
     <w:lvl w:ilvl="3">
       <w:start w:val="1"/>
-      <w:numFmt w:val="decimal"/>
-      <w:lvlText w:val="%4."/>
+      <w:numFmt w:val="bullet"/>
+      <w:lvlText w:val=""/>
       <w:lvlJc w:val="left"/>
       <w:pPr>
         <w:tabs>
@@ -4986,12 +6000,14 @@
         </w:tabs>
         <w:ind w:left="2836" w:hanging="283"/>
       </w:pPr>
-      <w:rPr/>
+      <w:rPr>
+        <w:rFonts w:ascii="Symbol" w:hAnsi="Symbol" w:cs="Symbol" w:hint="default"/>
+      </w:rPr>
     </w:lvl>
     <w:lvl w:ilvl="4">
       <w:start w:val="1"/>
-      <w:numFmt w:val="decimal"/>
-      <w:lvlText w:val="%5."/>
+      <w:numFmt w:val="bullet"/>
+      <w:lvlText w:val=""/>
       <w:lvlJc w:val="left"/>
       <w:pPr>
         <w:tabs>
@@ -4999,12 +6015,14 @@
         </w:tabs>
         <w:ind w:left="3545" w:hanging="283"/>
       </w:pPr>
-      <w:rPr/>
+      <w:rPr>
+        <w:rFonts w:ascii="Symbol" w:hAnsi="Symbol" w:cs="Symbol" w:hint="default"/>
+      </w:rPr>
     </w:lvl>
     <w:lvl w:ilvl="5">
       <w:start w:val="1"/>
-      <w:numFmt w:val="decimal"/>
-      <w:lvlText w:val="%6."/>
+      <w:numFmt w:val="bullet"/>
+      <w:lvlText w:val=""/>
       <w:lvlJc w:val="left"/>
       <w:pPr>
         <w:tabs>
@@ -5012,12 +6030,14 @@
         </w:tabs>
         <w:ind w:left="4254" w:hanging="283"/>
       </w:pPr>
-      <w:rPr/>
+      <w:rPr>
+        <w:rFonts w:ascii="Symbol" w:hAnsi="Symbol" w:cs="Symbol" w:hint="default"/>
+      </w:rPr>
     </w:lvl>
     <w:lvl w:ilvl="6">
       <w:start w:val="1"/>
-      <w:numFmt w:val="decimal"/>
-      <w:lvlText w:val="%7."/>
+      <w:numFmt w:val="bullet"/>
+      <w:lvlText w:val=""/>
       <w:lvlJc w:val="left"/>
       <w:pPr>
         <w:tabs>
@@ -5025,12 +6045,14 @@
         </w:tabs>
         <w:ind w:left="4963" w:hanging="283"/>
       </w:pPr>
-      <w:rPr/>
+      <w:rPr>
+        <w:rFonts w:ascii="Symbol" w:hAnsi="Symbol" w:cs="Symbol" w:hint="default"/>
+      </w:rPr>
     </w:lvl>
     <w:lvl w:ilvl="7">
       <w:start w:val="1"/>
-      <w:numFmt w:val="decimal"/>
-      <w:lvlText w:val="%8."/>
+      <w:numFmt w:val="bullet"/>
+      <w:lvlText w:val=""/>
       <w:lvlJc w:val="left"/>
       <w:pPr>
         <w:tabs>
@@ -5038,12 +6060,14 @@
         </w:tabs>
         <w:ind w:left="5672" w:hanging="283"/>
       </w:pPr>
-      <w:rPr/>
+      <w:rPr>
+        <w:rFonts w:ascii="Symbol" w:hAnsi="Symbol" w:cs="Symbol" w:hint="default"/>
+      </w:rPr>
     </w:lvl>
     <w:lvl w:ilvl="8">
       <w:start w:val="1"/>
-      <w:numFmt w:val="decimal"/>
-      <w:lvlText w:val="%9."/>
+      <w:numFmt w:val="bullet"/>
+      <w:lvlText w:val=""/>
       <w:lvlJc w:val="left"/>
       <w:pPr>
         <w:tabs>
@@ -5051,14 +6075,16 @@
         </w:tabs>
         <w:ind w:left="6381" w:hanging="283"/>
       </w:pPr>
-      <w:rPr/>
+      <w:rPr>
+        <w:rFonts w:ascii="Symbol" w:hAnsi="Symbol" w:cs="Symbol" w:hint="default"/>
+      </w:rPr>
     </w:lvl>
   </w:abstractNum>
   <w:abstractNum w:abstractNumId="9">
     <w:lvl w:ilvl="0">
       <w:start w:val="1"/>
-      <w:numFmt w:val="bullet"/>
-      <w:lvlText w:val=""/>
+      <w:numFmt w:val="decimal"/>
+      <w:lvlText w:val="%1."/>
       <w:lvlJc w:val="left"/>
       <w:pPr>
         <w:tabs>
@@ -5066,14 +6092,12 @@
         </w:tabs>
         <w:ind w:left="709" w:hanging="283"/>
       </w:pPr>
-      <w:rPr>
-        <w:rFonts w:ascii="Symbol" w:hAnsi="Symbol" w:cs="Symbol" w:hint="default"/>
-      </w:rPr>
+      <w:rPr/>
     </w:lvl>
     <w:lvl w:ilvl="1">
       <w:start w:val="1"/>
-      <w:numFmt w:val="bullet"/>
-      <w:lvlText w:val=""/>
+      <w:numFmt w:val="decimal"/>
+      <w:lvlText w:val="%2."/>
       <w:lvlJc w:val="left"/>
       <w:pPr>
         <w:tabs>
@@ -5081,14 +6105,12 @@
         </w:tabs>
         <w:ind w:left="1418" w:hanging="283"/>
       </w:pPr>
-      <w:rPr>
-        <w:rFonts w:ascii="Symbol" w:hAnsi="Symbol" w:cs="Symbol" w:hint="default"/>
-      </w:rPr>
+      <w:rPr/>
     </w:lvl>
     <w:lvl w:ilvl="2">
       <w:start w:val="1"/>
-      <w:numFmt w:val="bullet"/>
-      <w:lvlText w:val=""/>
+      <w:numFmt w:val="decimal"/>
+      <w:lvlText w:val="%3."/>
       <w:lvlJc w:val="left"/>
       <w:pPr>
         <w:tabs>
@@ -5096,14 +6118,12 @@
         </w:tabs>
         <w:ind w:left="2127" w:hanging="283"/>
       </w:pPr>
-      <w:rPr>
-        <w:rFonts w:ascii="Symbol" w:hAnsi="Symbol" w:cs="Symbol" w:hint="default"/>
-      </w:rPr>
+      <w:rPr/>
     </w:lvl>
     <w:lvl w:ilvl="3">
       <w:start w:val="1"/>
-      <w:numFmt w:val="bullet"/>
-      <w:lvlText w:val=""/>
+      <w:numFmt w:val="decimal"/>
+      <w:lvlText w:val="%4."/>
       <w:lvlJc w:val="left"/>
       <w:pPr>
         <w:tabs>
@@ -5111,14 +6131,12 @@
         </w:tabs>
         <w:ind w:left="2836" w:hanging="283"/>
       </w:pPr>
-      <w:rPr>
-        <w:rFonts w:ascii="Symbol" w:hAnsi="Symbol" w:cs="Symbol" w:hint="default"/>
-      </w:rPr>
+      <w:rPr/>
     </w:lvl>
     <w:lvl w:ilvl="4">
       <w:start w:val="1"/>
-      <w:numFmt w:val="bullet"/>
-      <w:lvlText w:val=""/>
+      <w:numFmt w:val="decimal"/>
+      <w:lvlText w:val="%5."/>
       <w:lvlJc w:val="left"/>
       <w:pPr>
         <w:tabs>
@@ -5126,14 +6144,12 @@
         </w:tabs>
         <w:ind w:left="3545" w:hanging="283"/>
       </w:pPr>
-      <w:rPr>
-        <w:rFonts w:ascii="Symbol" w:hAnsi="Symbol" w:cs="Symbol" w:hint="default"/>
-      </w:rPr>
+      <w:rPr/>
     </w:lvl>
     <w:lvl w:ilvl="5">
       <w:start w:val="1"/>
-      <w:numFmt w:val="bullet"/>
-      <w:lvlText w:val=""/>
+      <w:numFmt w:val="decimal"/>
+      <w:lvlText w:val="%6."/>
       <w:lvlJc w:val="left"/>
       <w:pPr>
         <w:tabs>
@@ -5141,14 +6157,12 @@
         </w:tabs>
         <w:ind w:left="4254" w:hanging="283"/>
       </w:pPr>
-      <w:rPr>
-        <w:rFonts w:ascii="Symbol" w:hAnsi="Symbol" w:cs="Symbol" w:hint="default"/>
-      </w:rPr>
+      <w:rPr/>
     </w:lvl>
     <w:lvl w:ilvl="6">
       <w:start w:val="1"/>
-      <w:numFmt w:val="bullet"/>
-      <w:lvlText w:val=""/>
+      <w:numFmt w:val="decimal"/>
+      <w:lvlText w:val="%7."/>
       <w:lvlJc w:val="left"/>
       <w:pPr>
         <w:tabs>
@@ -5156,14 +6170,12 @@
         </w:tabs>
         <w:ind w:left="4963" w:hanging="283"/>
       </w:pPr>
-      <w:rPr>
-        <w:rFonts w:ascii="Symbol" w:hAnsi="Symbol" w:cs="Symbol" w:hint="default"/>
-      </w:rPr>
+      <w:rPr/>
     </w:lvl>
     <w:lvl w:ilvl="7">
       <w:start w:val="1"/>
-      <w:numFmt w:val="bullet"/>
-      <w:lvlText w:val=""/>
+      <w:numFmt w:val="decimal"/>
+      <w:lvlText w:val="%8."/>
       <w:lvlJc w:val="left"/>
       <w:pPr>
         <w:tabs>
@@ -5171,14 +6183,12 @@
         </w:tabs>
         <w:ind w:left="5672" w:hanging="283"/>
       </w:pPr>
-      <w:rPr>
-        <w:rFonts w:ascii="Symbol" w:hAnsi="Symbol" w:cs="Symbol" w:hint="default"/>
-      </w:rPr>
+      <w:rPr/>
     </w:lvl>
     <w:lvl w:ilvl="8">
       <w:start w:val="1"/>
-      <w:numFmt w:val="bullet"/>
-      <w:lvlText w:val=""/>
+      <w:numFmt w:val="decimal"/>
+      <w:lvlText w:val="%9."/>
       <w:lvlJc w:val="left"/>
       <w:pPr>
         <w:tabs>
@@ -5186,9 +6196,7 @@
         </w:tabs>
         <w:ind w:left="6381" w:hanging="283"/>
       </w:pPr>
-      <w:rPr>
-        <w:rFonts w:ascii="Symbol" w:hAnsi="Symbol" w:cs="Symbol" w:hint="default"/>
-      </w:rPr>
+      <w:rPr/>
     </w:lvl>
   </w:abstractNum>
   <w:abstractNum w:abstractNumId="10">
@@ -6016,6 +7024,417 @@
   <w:abstractNum w:abstractNumId="16">
     <w:lvl w:ilvl="0">
       <w:start w:val="1"/>
+      <w:numFmt w:val="bullet"/>
+      <w:lvlText w:val=""/>
+      <w:lvlJc w:val="left"/>
+      <w:pPr>
+        <w:tabs>
+          <w:tab w:val="num" w:pos="709"/>
+        </w:tabs>
+        <w:ind w:left="709" w:hanging="283"/>
+      </w:pPr>
+      <w:rPr>
+        <w:rFonts w:ascii="Symbol" w:hAnsi="Symbol" w:cs="Symbol" w:hint="default"/>
+      </w:rPr>
+    </w:lvl>
+    <w:lvl w:ilvl="1">
+      <w:start w:val="1"/>
+      <w:numFmt w:val="bullet"/>
+      <w:lvlText w:val=""/>
+      <w:lvlJc w:val="left"/>
+      <w:pPr>
+        <w:tabs>
+          <w:tab w:val="num" w:pos="1418"/>
+        </w:tabs>
+        <w:ind w:left="1418" w:hanging="283"/>
+      </w:pPr>
+      <w:rPr>
+        <w:rFonts w:ascii="Symbol" w:hAnsi="Symbol" w:cs="Symbol" w:hint="default"/>
+      </w:rPr>
+    </w:lvl>
+    <w:lvl w:ilvl="2">
+      <w:start w:val="1"/>
+      <w:numFmt w:val="bullet"/>
+      <w:lvlText w:val=""/>
+      <w:lvlJc w:val="left"/>
+      <w:pPr>
+        <w:tabs>
+          <w:tab w:val="num" w:pos="2127"/>
+        </w:tabs>
+        <w:ind w:left="2127" w:hanging="283"/>
+      </w:pPr>
+      <w:rPr>
+        <w:rFonts w:ascii="Symbol" w:hAnsi="Symbol" w:cs="Symbol" w:hint="default"/>
+      </w:rPr>
+    </w:lvl>
+    <w:lvl w:ilvl="3">
+      <w:start w:val="1"/>
+      <w:numFmt w:val="bullet"/>
+      <w:lvlText w:val=""/>
+      <w:lvlJc w:val="left"/>
+      <w:pPr>
+        <w:tabs>
+          <w:tab w:val="num" w:pos="2836"/>
+        </w:tabs>
+        <w:ind w:left="2836" w:hanging="283"/>
+      </w:pPr>
+      <w:rPr>
+        <w:rFonts w:ascii="Symbol" w:hAnsi="Symbol" w:cs="Symbol" w:hint="default"/>
+      </w:rPr>
+    </w:lvl>
+    <w:lvl w:ilvl="4">
+      <w:start w:val="1"/>
+      <w:numFmt w:val="bullet"/>
+      <w:lvlText w:val=""/>
+      <w:lvlJc w:val="left"/>
+      <w:pPr>
+        <w:tabs>
+          <w:tab w:val="num" w:pos="3545"/>
+        </w:tabs>
+        <w:ind w:left="3545" w:hanging="283"/>
+      </w:pPr>
+      <w:rPr>
+        <w:rFonts w:ascii="Symbol" w:hAnsi="Symbol" w:cs="Symbol" w:hint="default"/>
+      </w:rPr>
+    </w:lvl>
+    <w:lvl w:ilvl="5">
+      <w:start w:val="1"/>
+      <w:numFmt w:val="bullet"/>
+      <w:lvlText w:val=""/>
+      <w:lvlJc w:val="left"/>
+      <w:pPr>
+        <w:tabs>
+          <w:tab w:val="num" w:pos="4254"/>
+        </w:tabs>
+        <w:ind w:left="4254" w:hanging="283"/>
+      </w:pPr>
+      <w:rPr>
+        <w:rFonts w:ascii="Symbol" w:hAnsi="Symbol" w:cs="Symbol" w:hint="default"/>
+      </w:rPr>
+    </w:lvl>
+    <w:lvl w:ilvl="6">
+      <w:start w:val="1"/>
+      <w:numFmt w:val="bullet"/>
+      <w:lvlText w:val=""/>
+      <w:lvlJc w:val="left"/>
+      <w:pPr>
+        <w:tabs>
+          <w:tab w:val="num" w:pos="4963"/>
+        </w:tabs>
+        <w:ind w:left="4963" w:hanging="283"/>
+      </w:pPr>
+      <w:rPr>
+        <w:rFonts w:ascii="Symbol" w:hAnsi="Symbol" w:cs="Symbol" w:hint="default"/>
+      </w:rPr>
+    </w:lvl>
+    <w:lvl w:ilvl="7">
+      <w:start w:val="1"/>
+      <w:numFmt w:val="bullet"/>
+      <w:lvlText w:val=""/>
+      <w:lvlJc w:val="left"/>
+      <w:pPr>
+        <w:tabs>
+          <w:tab w:val="num" w:pos="5672"/>
+        </w:tabs>
+        <w:ind w:left="5672" w:hanging="283"/>
+      </w:pPr>
+      <w:rPr>
+        <w:rFonts w:ascii="Symbol" w:hAnsi="Symbol" w:cs="Symbol" w:hint="default"/>
+      </w:rPr>
+    </w:lvl>
+    <w:lvl w:ilvl="8">
+      <w:start w:val="1"/>
+      <w:numFmt w:val="bullet"/>
+      <w:lvlText w:val=""/>
+      <w:lvlJc w:val="left"/>
+      <w:pPr>
+        <w:tabs>
+          <w:tab w:val="num" w:pos="6381"/>
+        </w:tabs>
+        <w:ind w:left="6381" w:hanging="283"/>
+      </w:pPr>
+      <w:rPr>
+        <w:rFonts w:ascii="Symbol" w:hAnsi="Symbol" w:cs="Symbol" w:hint="default"/>
+      </w:rPr>
+    </w:lvl>
+  </w:abstractNum>
+  <w:abstractNum w:abstractNumId="17">
+    <w:lvl w:ilvl="0">
+      <w:start w:val="1"/>
+      <w:numFmt w:val="bullet"/>
+      <w:lvlText w:val=""/>
+      <w:lvlJc w:val="left"/>
+      <w:pPr>
+        <w:tabs>
+          <w:tab w:val="num" w:pos="709"/>
+        </w:tabs>
+        <w:ind w:left="709" w:hanging="283"/>
+      </w:pPr>
+      <w:rPr>
+        <w:rFonts w:ascii="Symbol" w:hAnsi="Symbol" w:cs="Symbol" w:hint="default"/>
+      </w:rPr>
+    </w:lvl>
+    <w:lvl w:ilvl="1">
+      <w:start w:val="1"/>
+      <w:numFmt w:val="bullet"/>
+      <w:lvlText w:val=""/>
+      <w:lvlJc w:val="left"/>
+      <w:pPr>
+        <w:tabs>
+          <w:tab w:val="num" w:pos="1418"/>
+        </w:tabs>
+        <w:ind w:left="1418" w:hanging="283"/>
+      </w:pPr>
+      <w:rPr>
+        <w:rFonts w:ascii="Symbol" w:hAnsi="Symbol" w:cs="Symbol" w:hint="default"/>
+      </w:rPr>
+    </w:lvl>
+    <w:lvl w:ilvl="2">
+      <w:start w:val="1"/>
+      <w:numFmt w:val="bullet"/>
+      <w:lvlText w:val=""/>
+      <w:lvlJc w:val="left"/>
+      <w:pPr>
+        <w:tabs>
+          <w:tab w:val="num" w:pos="2127"/>
+        </w:tabs>
+        <w:ind w:left="2127" w:hanging="283"/>
+      </w:pPr>
+      <w:rPr>
+        <w:rFonts w:ascii="Symbol" w:hAnsi="Symbol" w:cs="Symbol" w:hint="default"/>
+      </w:rPr>
+    </w:lvl>
+    <w:lvl w:ilvl="3">
+      <w:start w:val="1"/>
+      <w:numFmt w:val="bullet"/>
+      <w:lvlText w:val=""/>
+      <w:lvlJc w:val="left"/>
+      <w:pPr>
+        <w:tabs>
+          <w:tab w:val="num" w:pos="2836"/>
+        </w:tabs>
+        <w:ind w:left="2836" w:hanging="283"/>
+      </w:pPr>
+      <w:rPr>
+        <w:rFonts w:ascii="Symbol" w:hAnsi="Symbol" w:cs="Symbol" w:hint="default"/>
+      </w:rPr>
+    </w:lvl>
+    <w:lvl w:ilvl="4">
+      <w:start w:val="1"/>
+      <w:numFmt w:val="bullet"/>
+      <w:lvlText w:val=""/>
+      <w:lvlJc w:val="left"/>
+      <w:pPr>
+        <w:tabs>
+          <w:tab w:val="num" w:pos="3545"/>
+        </w:tabs>
+        <w:ind w:left="3545" w:hanging="283"/>
+      </w:pPr>
+      <w:rPr>
+        <w:rFonts w:ascii="Symbol" w:hAnsi="Symbol" w:cs="Symbol" w:hint="default"/>
+      </w:rPr>
+    </w:lvl>
+    <w:lvl w:ilvl="5">
+      <w:start w:val="1"/>
+      <w:numFmt w:val="bullet"/>
+      <w:lvlText w:val=""/>
+      <w:lvlJc w:val="left"/>
+      <w:pPr>
+        <w:tabs>
+          <w:tab w:val="num" w:pos="4254"/>
+        </w:tabs>
+        <w:ind w:left="4254" w:hanging="283"/>
+      </w:pPr>
+      <w:rPr>
+        <w:rFonts w:ascii="Symbol" w:hAnsi="Symbol" w:cs="Symbol" w:hint="default"/>
+      </w:rPr>
+    </w:lvl>
+    <w:lvl w:ilvl="6">
+      <w:start w:val="1"/>
+      <w:numFmt w:val="bullet"/>
+      <w:lvlText w:val=""/>
+      <w:lvlJc w:val="left"/>
+      <w:pPr>
+        <w:tabs>
+          <w:tab w:val="num" w:pos="4963"/>
+        </w:tabs>
+        <w:ind w:left="4963" w:hanging="283"/>
+      </w:pPr>
+      <w:rPr>
+        <w:rFonts w:ascii="Symbol" w:hAnsi="Symbol" w:cs="Symbol" w:hint="default"/>
+      </w:rPr>
+    </w:lvl>
+    <w:lvl w:ilvl="7">
+      <w:start w:val="1"/>
+      <w:numFmt w:val="bullet"/>
+      <w:lvlText w:val=""/>
+      <w:lvlJc w:val="left"/>
+      <w:pPr>
+        <w:tabs>
+          <w:tab w:val="num" w:pos="5672"/>
+        </w:tabs>
+        <w:ind w:left="5672" w:hanging="283"/>
+      </w:pPr>
+      <w:rPr>
+        <w:rFonts w:ascii="Symbol" w:hAnsi="Symbol" w:cs="Symbol" w:hint="default"/>
+      </w:rPr>
+    </w:lvl>
+    <w:lvl w:ilvl="8">
+      <w:start w:val="1"/>
+      <w:numFmt w:val="bullet"/>
+      <w:lvlText w:val=""/>
+      <w:lvlJc w:val="left"/>
+      <w:pPr>
+        <w:tabs>
+          <w:tab w:val="num" w:pos="6381"/>
+        </w:tabs>
+        <w:ind w:left="6381" w:hanging="283"/>
+      </w:pPr>
+      <w:rPr>
+        <w:rFonts w:ascii="Symbol" w:hAnsi="Symbol" w:cs="Symbol" w:hint="default"/>
+      </w:rPr>
+    </w:lvl>
+  </w:abstractNum>
+  <w:abstractNum w:abstractNumId="18">
+    <w:lvl w:ilvl="0">
+      <w:start w:val="1"/>
+      <w:numFmt w:val="bullet"/>
+      <w:lvlText w:val=""/>
+      <w:lvlJc w:val="left"/>
+      <w:pPr>
+        <w:tabs>
+          <w:tab w:val="num" w:pos="709"/>
+        </w:tabs>
+        <w:ind w:left="709" w:hanging="283"/>
+      </w:pPr>
+      <w:rPr>
+        <w:rFonts w:ascii="Symbol" w:hAnsi="Symbol" w:cs="Symbol" w:hint="default"/>
+      </w:rPr>
+    </w:lvl>
+    <w:lvl w:ilvl="1">
+      <w:start w:val="1"/>
+      <w:numFmt w:val="bullet"/>
+      <w:lvlText w:val=""/>
+      <w:lvlJc w:val="left"/>
+      <w:pPr>
+        <w:tabs>
+          <w:tab w:val="num" w:pos="1418"/>
+        </w:tabs>
+        <w:ind w:left="1418" w:hanging="283"/>
+      </w:pPr>
+      <w:rPr>
+        <w:rFonts w:ascii="Symbol" w:hAnsi="Symbol" w:cs="Symbol" w:hint="default"/>
+      </w:rPr>
+    </w:lvl>
+    <w:lvl w:ilvl="2">
+      <w:start w:val="1"/>
+      <w:numFmt w:val="bullet"/>
+      <w:lvlText w:val=""/>
+      <w:lvlJc w:val="left"/>
+      <w:pPr>
+        <w:tabs>
+          <w:tab w:val="num" w:pos="2127"/>
+        </w:tabs>
+        <w:ind w:left="2127" w:hanging="283"/>
+      </w:pPr>
+      <w:rPr>
+        <w:rFonts w:ascii="Symbol" w:hAnsi="Symbol" w:cs="Symbol" w:hint="default"/>
+      </w:rPr>
+    </w:lvl>
+    <w:lvl w:ilvl="3">
+      <w:start w:val="1"/>
+      <w:numFmt w:val="bullet"/>
+      <w:lvlText w:val=""/>
+      <w:lvlJc w:val="left"/>
+      <w:pPr>
+        <w:tabs>
+          <w:tab w:val="num" w:pos="2836"/>
+        </w:tabs>
+        <w:ind w:left="2836" w:hanging="283"/>
+      </w:pPr>
+      <w:rPr>
+        <w:rFonts w:ascii="Symbol" w:hAnsi="Symbol" w:cs="Symbol" w:hint="default"/>
+      </w:rPr>
+    </w:lvl>
+    <w:lvl w:ilvl="4">
+      <w:start w:val="1"/>
+      <w:numFmt w:val="bullet"/>
+      <w:lvlText w:val=""/>
+      <w:lvlJc w:val="left"/>
+      <w:pPr>
+        <w:tabs>
+          <w:tab w:val="num" w:pos="3545"/>
+        </w:tabs>
+        <w:ind w:left="3545" w:hanging="283"/>
+      </w:pPr>
+      <w:rPr>
+        <w:rFonts w:ascii="Symbol" w:hAnsi="Symbol" w:cs="Symbol" w:hint="default"/>
+      </w:rPr>
+    </w:lvl>
+    <w:lvl w:ilvl="5">
+      <w:start w:val="1"/>
+      <w:numFmt w:val="bullet"/>
+      <w:lvlText w:val=""/>
+      <w:lvlJc w:val="left"/>
+      <w:pPr>
+        <w:tabs>
+          <w:tab w:val="num" w:pos="4254"/>
+        </w:tabs>
+        <w:ind w:left="4254" w:hanging="283"/>
+      </w:pPr>
+      <w:rPr>
+        <w:rFonts w:ascii="Symbol" w:hAnsi="Symbol" w:cs="Symbol" w:hint="default"/>
+      </w:rPr>
+    </w:lvl>
+    <w:lvl w:ilvl="6">
+      <w:start w:val="1"/>
+      <w:numFmt w:val="bullet"/>
+      <w:lvlText w:val=""/>
+      <w:lvlJc w:val="left"/>
+      <w:pPr>
+        <w:tabs>
+          <w:tab w:val="num" w:pos="4963"/>
+        </w:tabs>
+        <w:ind w:left="4963" w:hanging="283"/>
+      </w:pPr>
+      <w:rPr>
+        <w:rFonts w:ascii="Symbol" w:hAnsi="Symbol" w:cs="Symbol" w:hint="default"/>
+      </w:rPr>
+    </w:lvl>
+    <w:lvl w:ilvl="7">
+      <w:start w:val="1"/>
+      <w:numFmt w:val="bullet"/>
+      <w:lvlText w:val=""/>
+      <w:lvlJc w:val="left"/>
+      <w:pPr>
+        <w:tabs>
+          <w:tab w:val="num" w:pos="5672"/>
+        </w:tabs>
+        <w:ind w:left="5672" w:hanging="283"/>
+      </w:pPr>
+      <w:rPr>
+        <w:rFonts w:ascii="Symbol" w:hAnsi="Symbol" w:cs="Symbol" w:hint="default"/>
+      </w:rPr>
+    </w:lvl>
+    <w:lvl w:ilvl="8">
+      <w:start w:val="1"/>
+      <w:numFmt w:val="bullet"/>
+      <w:lvlText w:val=""/>
+      <w:lvlJc w:val="left"/>
+      <w:pPr>
+        <w:tabs>
+          <w:tab w:val="num" w:pos="6381"/>
+        </w:tabs>
+        <w:ind w:left="6381" w:hanging="283"/>
+      </w:pPr>
+      <w:rPr>
+        <w:rFonts w:ascii="Symbol" w:hAnsi="Symbol" w:cs="Symbol" w:hint="default"/>
+      </w:rPr>
+    </w:lvl>
+  </w:abstractNum>
+  <w:abstractNum w:abstractNumId="19">
+    <w:lvl w:ilvl="0">
+      <w:start w:val="1"/>
       <w:numFmt w:val="decimal"/>
       <w:lvlText w:val="%1."/>
       <w:lvlJc w:val="left"/>
@@ -6132,7 +7551,7 @@
       <w:rPr/>
     </w:lvl>
   </w:abstractNum>
-  <w:abstractNum w:abstractNumId="17">
+  <w:abstractNum w:abstractNumId="20">
     <w:lvl w:ilvl="0">
       <w:start w:val="1"/>
       <w:numFmt w:val="bullet"/>
@@ -6319,6 +7738,15 @@
   </w:num>
   <w:num w:numId="17">
     <w:abstractNumId w:val="17"/>
+  </w:num>
+  <w:num w:numId="18">
+    <w:abstractNumId w:val="18"/>
+  </w:num>
+  <w:num w:numId="19">
+    <w:abstractNumId w:val="19"/>
+  </w:num>
+  <w:num w:numId="20">
+    <w:abstractNumId w:val="20"/>
   </w:num>
 </w:numbering>
 </file>
@@ -6483,23 +7911,6 @@
     </w:pPr>
     <w:rPr>
       <w:rFonts w:cs="Arial Unicode MS"/>
-    </w:rPr>
-  </w:style>
-  <w:style w:type="paragraph" w:styleId="HorizontalLine">
-    <w:name w:val="Horizontal Line"/>
-    <w:basedOn w:val="Normal"/>
-    <w:next w:val="BodyText"/>
-    <w:qFormat/>
-    <w:pPr>
-      <w:suppressLineNumbers/>
-      <w:pBdr>
-        <w:bottom w:val="double" w:sz="2" w:space="0" w:color="808080"/>
-      </w:pBdr>
-      <w:spacing w:before="0" w:after="283"/>
-    </w:pPr>
-    <w:rPr>
-      <w:sz w:val="12"/>
-      <w:szCs w:val="12"/>
     </w:rPr>
   </w:style>
   <w:style w:type="paragraph" w:styleId="BlockQuotation">

</xml_diff>